<commit_message>
vault backup: 2026-01-02 12:38:45
</commit_message>
<xml_diff>
--- a/蛋白质化学/《蛋白质化学》复习题.docx
+++ b/蛋白质化学/《蛋白质化学》复习题.docx
@@ -1,6 +1,6 @@
 
 <file path=word/document.xml><?xml version="1.0" encoding="utf-8"?>
-<w:document xmlns:wpc="http://schemas.microsoft.com/office/word/2010/wordprocessingCanvas" xmlns:cx="http://schemas.microsoft.com/office/drawing/2014/chartex" xmlns:cx1="http://schemas.microsoft.com/office/drawing/2015/9/8/chartex" xmlns:cx2="http://schemas.microsoft.com/office/drawing/2015/10/21/chartex" xmlns:cx3="http://schemas.microsoft.com/office/drawing/2016/5/9/chartex" xmlns:cx4="http://schemas.microsoft.com/office/drawing/2016/5/10/chartex" xmlns:cx5="http://schemas.microsoft.com/office/drawing/2016/5/11/chartex" xmlns:cx6="http://schemas.microsoft.com/office/drawing/2016/5/12/chartex" xmlns:cx7="http://schemas.microsoft.com/office/drawing/2016/5/13/chartex" xmlns:cx8="http://schemas.microsoft.com/office/drawing/2016/5/14/chartex" xmlns:mc="http://schemas.openxmlformats.org/markup-compatibility/2006" xmlns:aink="http://schemas.microsoft.com/office/drawing/2016/ink" xmlns:am3d="http://schemas.microsoft.com/office/drawing/2017/model3d" xmlns:o="urn:schemas-microsoft-com:office:office" xmlns:oel="http://schemas.microsoft.com/office/2019/extlst" xmlns:r="http://schemas.openxmlformats.org/officeDocument/2006/relationships" xmlns:m="http://schemas.openxmlformats.org/officeDocument/2006/math" xmlns:v="urn:schemas-microsoft-com:vml" xmlns:wp14="http://schemas.microsoft.com/office/word/2010/wordprocessingDrawing" xmlns:wp="http://schemas.openxmlformats.org/drawingml/2006/wordprocessingDrawing" xmlns:w10="urn:schemas-microsoft-com:office:word" xmlns:w="http://schemas.openxmlformats.org/wordprocessingml/2006/main" xmlns:w14="http://schemas.microsoft.com/office/word/2010/wordml" xmlns:w15="http://schemas.microsoft.com/office/word/2012/wordml" xmlns:w16cex="http://schemas.microsoft.com/office/word/2018/wordml/cex" xmlns:w16cid="http://schemas.microsoft.com/office/word/2016/wordml/cid" xmlns:w16="http://schemas.microsoft.com/office/word/2018/wordml" xmlns:w16du="http://schemas.microsoft.com/office/word/2023/wordml/word16du" xmlns:w16sdtdh="http://schemas.microsoft.com/office/word/2020/wordml/sdtdatahash" xmlns:w16sdtfl="http://schemas.microsoft.com/office/word/2024/wordml/sdtformatlock" xmlns:w16se="http://schemas.microsoft.com/office/word/2015/wordml/symex" xmlns:wpg="http://schemas.microsoft.com/office/word/2010/wordprocessingGroup" xmlns:wpi="http://schemas.microsoft.com/office/word/2010/wordprocessingInk" xmlns:wne="http://schemas.microsoft.com/office/word/2006/wordml" xmlns:wps="http://schemas.microsoft.com/office/word/2010/wordprocessingShape" mc:Ignorable="w14 w15 w16se w16cid w16 w16cex w16sdtdh w16sdtfl w16du wp14">
+<w:document xmlns:wpc="http://schemas.microsoft.com/office/word/2010/wordprocessingCanvas" xmlns:cx="http://schemas.microsoft.com/office/drawing/2014/chartex" xmlns:cx1="http://schemas.microsoft.com/office/drawing/2015/9/8/chartex" xmlns:cx2="http://schemas.microsoft.com/office/drawing/2015/10/21/chartex" xmlns:cx3="http://schemas.microsoft.com/office/drawing/2016/5/9/chartex" xmlns:cx4="http://schemas.microsoft.com/office/drawing/2016/5/10/chartex" xmlns:cx5="http://schemas.microsoft.com/office/drawing/2016/5/11/chartex" xmlns:cx6="http://schemas.microsoft.com/office/drawing/2016/5/12/chartex" xmlns:cx7="http://schemas.microsoft.com/office/drawing/2016/5/13/chartex" xmlns:cx8="http://schemas.microsoft.com/office/drawing/2016/5/14/chartex" xmlns:mc="http://schemas.openxmlformats.org/markup-compatibility/2006" xmlns:aink="http://schemas.microsoft.com/office/drawing/2016/ink" xmlns:am3d="http://schemas.microsoft.com/office/drawing/2017/model3d" xmlns:o="urn:schemas-microsoft-com:office:office" xmlns:r="http://schemas.openxmlformats.org/officeDocument/2006/relationships" xmlns:m="http://schemas.openxmlformats.org/officeDocument/2006/math" xmlns:v="urn:schemas-microsoft-com:vml" xmlns:wp14="http://schemas.microsoft.com/office/word/2010/wordprocessingDrawing" xmlns:wp="http://schemas.openxmlformats.org/drawingml/2006/wordprocessingDrawing" xmlns:w10="urn:schemas-microsoft-com:office:word" xmlns:w="http://schemas.openxmlformats.org/wordprocessingml/2006/main" xmlns:w14="http://schemas.microsoft.com/office/word/2010/wordml" xmlns:w15="http://schemas.microsoft.com/office/word/2012/wordml" xmlns:w16cex="http://schemas.microsoft.com/office/word/2018/wordml/cex" xmlns:w16cid="http://schemas.microsoft.com/office/word/2016/wordml/cid" xmlns:w16="http://schemas.microsoft.com/office/word/2018/wordml" xmlns:w16sdtdh="http://schemas.microsoft.com/office/word/2020/wordml/sdtdatahash" xmlns:w16se="http://schemas.microsoft.com/office/word/2015/wordml/symex" xmlns:wpg="http://schemas.microsoft.com/office/word/2010/wordprocessingGroup" xmlns:wpi="http://schemas.microsoft.com/office/word/2010/wordprocessingInk" xmlns:wne="http://schemas.microsoft.com/office/word/2006/wordml" xmlns:wps="http://schemas.microsoft.com/office/word/2010/wordprocessingShape" mc:Ignorable="w14 w15 w16se w16cid w16 w16cex w16sdtdh wp14">
   <w:body>
     <w:p>
       <w:pPr>
@@ -4258,8 +4258,16 @@
         <w:rPr>
           <w:rFonts w:ascii="Times New Roman" w:eastAsia="楷体" w:hAnsi="Times New Roman" w:cs="Times New Roman" w:hint="eastAsia"/>
         </w:rPr>
-        <w:t>阻止氨基酰</w:t>
-      </w:r>
+        <w:t>阻止氨基</w:t>
+      </w:r>
+      <w:proofErr w:type="gramStart"/>
+      <w:r>
+        <w:rPr>
+          <w:rFonts w:ascii="Times New Roman" w:eastAsia="楷体" w:hAnsi="Times New Roman" w:cs="Times New Roman" w:hint="eastAsia"/>
+        </w:rPr>
+        <w:t>酰</w:t>
+      </w:r>
+      <w:proofErr w:type="gramEnd"/>
       <w:r>
         <w:rPr>
           <w:rFonts w:ascii="Times New Roman" w:eastAsia="楷体" w:hAnsi="Times New Roman" w:cs="Times New Roman" w:hint="eastAsia"/>
@@ -4343,8 +4351,16 @@
         <w:rPr>
           <w:rFonts w:ascii="Times New Roman" w:eastAsia="楷体" w:hAnsi="Times New Roman" w:cs="Times New Roman" w:hint="eastAsia"/>
         </w:rPr>
-        <w:t>结合到新生肽</w:t>
-      </w:r>
+        <w:t>结合到新生</w:t>
+      </w:r>
+      <w:proofErr w:type="gramStart"/>
+      <w:r>
+        <w:rPr>
+          <w:rFonts w:ascii="Times New Roman" w:eastAsia="楷体" w:hAnsi="Times New Roman" w:cs="Times New Roman" w:hint="eastAsia"/>
+        </w:rPr>
+        <w:t>肽</w:t>
+      </w:r>
+      <w:proofErr w:type="gramEnd"/>
       <w:r>
         <w:rPr>
           <w:rFonts w:ascii="Times New Roman" w:eastAsia="楷体" w:hAnsi="Times New Roman" w:cs="Times New Roman" w:hint="eastAsia"/>
@@ -5755,7 +5771,21 @@
         <w:rPr>
           <w:rFonts w:ascii="Times New Roman" w:eastAsia="楷体" w:hAnsi="Times New Roman" w:cs="Times New Roman" w:hint="eastAsia"/>
         </w:rPr>
-        <w:t>、下列哪个蛋白在介导蛋白质从胞核转运到胞质中发挥作用（</w:t>
+        <w:t>、下列哪个蛋白在</w:t>
+      </w:r>
+      <w:proofErr w:type="gramStart"/>
+      <w:r>
+        <w:rPr>
+          <w:rFonts w:ascii="Times New Roman" w:eastAsia="楷体" w:hAnsi="Times New Roman" w:cs="Times New Roman" w:hint="eastAsia"/>
+        </w:rPr>
+        <w:t>介</w:t>
+      </w:r>
+      <w:proofErr w:type="gramEnd"/>
+      <w:r>
+        <w:rPr>
+          <w:rFonts w:ascii="Times New Roman" w:eastAsia="楷体" w:hAnsi="Times New Roman" w:cs="Times New Roman" w:hint="eastAsia"/>
+        </w:rPr>
+        <w:t>导蛋白质从胞核转运到胞质中发挥作用（</w:t>
       </w:r>
       <w:r>
         <w:rPr>
@@ -5955,7 +5985,35 @@
         <w:rPr>
           <w:rFonts w:ascii="Times New Roman" w:eastAsia="楷体" w:hAnsi="Times New Roman" w:cs="Times New Roman" w:hint="eastAsia"/>
         </w:rPr>
-        <w:t>、真核细胞中很多核定位蛋白依赖于肽段中的入核信号被转运到细胞核中。入核信号往往是一段连续的（</w:t>
+        <w:t>、真核细胞中很多核定位蛋白依赖于肽段中</w:t>
+      </w:r>
+      <w:proofErr w:type="gramStart"/>
+      <w:r>
+        <w:rPr>
+          <w:rFonts w:ascii="Times New Roman" w:eastAsia="楷体" w:hAnsi="Times New Roman" w:cs="Times New Roman" w:hint="eastAsia"/>
+        </w:rPr>
+        <w:t>的入核信号</w:t>
+      </w:r>
+      <w:proofErr w:type="gramEnd"/>
+      <w:r>
+        <w:rPr>
+          <w:rFonts w:ascii="Times New Roman" w:eastAsia="楷体" w:hAnsi="Times New Roman" w:cs="Times New Roman" w:hint="eastAsia"/>
+        </w:rPr>
+        <w:t>被转运到细胞核中。</w:t>
+      </w:r>
+      <w:proofErr w:type="gramStart"/>
+      <w:r>
+        <w:rPr>
+          <w:rFonts w:ascii="Times New Roman" w:eastAsia="楷体" w:hAnsi="Times New Roman" w:cs="Times New Roman" w:hint="eastAsia"/>
+        </w:rPr>
+        <w:t>入核信号</w:t>
+      </w:r>
+      <w:proofErr w:type="gramEnd"/>
+      <w:r>
+        <w:rPr>
+          <w:rFonts w:ascii="Times New Roman" w:eastAsia="楷体" w:hAnsi="Times New Roman" w:cs="Times New Roman" w:hint="eastAsia"/>
+        </w:rPr>
+        <w:t>往往是一段连续的（</w:t>
       </w:r>
       <w:r>
         <w:rPr>
@@ -6819,8 +6877,16 @@
         <w:rPr>
           <w:rFonts w:ascii="Times New Roman" w:eastAsia="楷体" w:hAnsi="Times New Roman" w:cs="Times New Roman" w:hint="eastAsia"/>
         </w:rPr>
-        <w:t>含正电面和疏水面</w:t>
-      </w:r>
+        <w:t>含正电面和</w:t>
+      </w:r>
+      <w:proofErr w:type="gramStart"/>
+      <w:r>
+        <w:rPr>
+          <w:rFonts w:ascii="Times New Roman" w:eastAsia="楷体" w:hAnsi="Times New Roman" w:cs="Times New Roman" w:hint="eastAsia"/>
+        </w:rPr>
+        <w:t>疏水面</w:t>
+      </w:r>
+      <w:proofErr w:type="gramEnd"/>
       <w:r>
         <w:rPr>
           <w:rFonts w:ascii="Times New Roman" w:eastAsia="楷体" w:hAnsi="Times New Roman" w:cs="Times New Roman"/>
@@ -6869,7 +6935,21 @@
         <w:rPr>
           <w:rFonts w:ascii="Times New Roman" w:eastAsia="楷体" w:hAnsi="Times New Roman" w:cs="Times New Roman"/>
         </w:rPr>
-        <w:t>、介导蛋白质转运到线粒体的</w:t>
+        <w:t>、</w:t>
+      </w:r>
+      <w:proofErr w:type="gramStart"/>
+      <w:r>
+        <w:rPr>
+          <w:rFonts w:ascii="Times New Roman" w:eastAsia="楷体" w:hAnsi="Times New Roman" w:cs="Times New Roman"/>
+        </w:rPr>
+        <w:t>介</w:t>
+      </w:r>
+      <w:proofErr w:type="gramEnd"/>
+      <w:r>
+        <w:rPr>
+          <w:rFonts w:ascii="Times New Roman" w:eastAsia="楷体" w:hAnsi="Times New Roman" w:cs="Times New Roman"/>
+        </w:rPr>
+        <w:t>导蛋白质转运到线粒体的</w:t>
       </w:r>
       <w:r>
         <w:rPr>
@@ -7091,7 +7171,21 @@
         <w:rPr>
           <w:rFonts w:ascii="Times New Roman" w:eastAsia="楷体" w:hAnsi="Times New Roman" w:cs="Times New Roman" w:hint="eastAsia"/>
         </w:rPr>
-        <w:t>、介导</w:t>
+        <w:t>、</w:t>
+      </w:r>
+      <w:proofErr w:type="gramStart"/>
+      <w:r>
+        <w:rPr>
+          <w:rFonts w:ascii="Times New Roman" w:eastAsia="楷体" w:hAnsi="Times New Roman" w:cs="Times New Roman" w:hint="eastAsia"/>
+        </w:rPr>
+        <w:t>介</w:t>
+      </w:r>
+      <w:proofErr w:type="gramEnd"/>
+      <w:r>
+        <w:rPr>
+          <w:rFonts w:ascii="Times New Roman" w:eastAsia="楷体" w:hAnsi="Times New Roman" w:cs="Times New Roman" w:hint="eastAsia"/>
+        </w:rPr>
+        <w:t>导</w:t>
       </w:r>
       <w:r>
         <w:rPr>
@@ -8590,6 +8684,24 @@
         <w:rPr>
           <w:rFonts w:ascii="Times New Roman" w:eastAsia="楷体" w:hAnsi="Times New Roman" w:cs="Times New Roman"/>
         </w:rPr>
+        <w:t>(</w:t>
+      </w:r>
+      <w:r>
+        <w:rPr>
+          <w:rFonts w:ascii="Times New Roman" w:eastAsia="楷体" w:hAnsi="Times New Roman" w:cs="Times New Roman" w:hint="eastAsia"/>
+        </w:rPr>
+        <w:t>肯定饿了</w:t>
+      </w:r>
+      <w:r>
+        <w:rPr>
+          <w:rFonts w:ascii="Times New Roman" w:eastAsia="楷体" w:hAnsi="Times New Roman" w:cs="Times New Roman"/>
+        </w:rPr>
+        <w:t>)</w:t>
+      </w:r>
+      <w:r>
+        <w:rPr>
+          <w:rFonts w:ascii="Times New Roman" w:eastAsia="楷体" w:hAnsi="Times New Roman" w:cs="Times New Roman"/>
+        </w:rPr>
         <w:t xml:space="preserve">                    </w:t>
       </w:r>
       <w:r>
@@ -8603,18 +8715,6 @@
           <w:rFonts w:ascii="Times New Roman" w:eastAsia="楷体" w:hAnsi="Times New Roman" w:cs="Times New Roman"/>
         </w:rPr>
         <w:tab/>
-      </w:r>
-      <w:r>
-        <w:rPr>
-          <w:rFonts w:ascii="Times New Roman" w:eastAsia="楷体" w:hAnsi="Times New Roman" w:cs="Times New Roman"/>
-        </w:rPr>
-        <w:tab/>
-      </w:r>
-      <w:r>
-        <w:rPr>
-          <w:rFonts w:ascii="Times New Roman" w:eastAsia="楷体" w:hAnsi="Times New Roman" w:cs="Times New Roman"/>
-        </w:rPr>
-        <w:tab/>
         <w:t>D</w:t>
       </w:r>
       <w:r>
@@ -8984,7 +9084,21 @@
         <w:rPr>
           <w:rFonts w:ascii="Times New Roman" w:eastAsia="楷体" w:hAnsi="Times New Roman" w:cs="Times New Roman" w:hint="eastAsia"/>
         </w:rPr>
-        <w:t>）介导的：</w:t>
+        <w:t>）</w:t>
+      </w:r>
+      <w:proofErr w:type="gramStart"/>
+      <w:r>
+        <w:rPr>
+          <w:rFonts w:ascii="Times New Roman" w:eastAsia="楷体" w:hAnsi="Times New Roman" w:cs="Times New Roman" w:hint="eastAsia"/>
+        </w:rPr>
+        <w:t>介</w:t>
+      </w:r>
+      <w:proofErr w:type="gramEnd"/>
+      <w:r>
+        <w:rPr>
+          <w:rFonts w:ascii="Times New Roman" w:eastAsia="楷体" w:hAnsi="Times New Roman" w:cs="Times New Roman" w:hint="eastAsia"/>
+        </w:rPr>
+        <w:t>导的：</w:t>
       </w:r>
     </w:p>
     <w:p>
@@ -9677,11 +9791,19 @@
         </w:rPr>
         <w:t>．</w:t>
       </w:r>
-      <w:r>
-        <w:rPr>
-          <w:rFonts w:ascii="Times New Roman" w:eastAsia="楷体" w:hAnsi="Times New Roman" w:cs="Times New Roman" w:hint="eastAsia"/>
-        </w:rPr>
-        <w:t>PI(3,4,5)P</w:t>
+      <w:proofErr w:type="gramStart"/>
+      <w:r>
+        <w:rPr>
+          <w:rFonts w:ascii="Times New Roman" w:eastAsia="楷体" w:hAnsi="Times New Roman" w:cs="Times New Roman" w:hint="eastAsia"/>
+        </w:rPr>
+        <w:t>PI(</w:t>
+      </w:r>
+      <w:proofErr w:type="gramEnd"/>
+      <w:r>
+        <w:rPr>
+          <w:rFonts w:ascii="Times New Roman" w:eastAsia="楷体" w:hAnsi="Times New Roman" w:cs="Times New Roman" w:hint="eastAsia"/>
+        </w:rPr>
+        <w:t>3,4,5)P</w:t>
       </w:r>
       <w:r>
         <w:rPr>
@@ -9765,11 +9887,19 @@
         </w:rPr>
         <w:t>．</w:t>
       </w:r>
-      <w:r>
-        <w:rPr>
-          <w:rFonts w:ascii="Times New Roman" w:eastAsia="楷体" w:hAnsi="Times New Roman" w:cs="Times New Roman" w:hint="eastAsia"/>
-        </w:rPr>
-        <w:t>PI(4)P</w:t>
+      <w:proofErr w:type="gramStart"/>
+      <w:r>
+        <w:rPr>
+          <w:rFonts w:ascii="Times New Roman" w:eastAsia="楷体" w:hAnsi="Times New Roman" w:cs="Times New Roman" w:hint="eastAsia"/>
+        </w:rPr>
+        <w:t>PI(</w:t>
+      </w:r>
+      <w:proofErr w:type="gramEnd"/>
+      <w:r>
+        <w:rPr>
+          <w:rFonts w:ascii="Times New Roman" w:eastAsia="楷体" w:hAnsi="Times New Roman" w:cs="Times New Roman" w:hint="eastAsia"/>
+        </w:rPr>
+        <w:t>4)P</w:t>
       </w:r>
       <w:r>
         <w:rPr>
@@ -9839,6 +9969,7 @@
         </w:rPr>
         <w:t>β</w:t>
       </w:r>
+      <w:proofErr w:type="gramStart"/>
       <w:r>
         <w:rPr>
           <w:rFonts w:ascii="Times New Roman" w:eastAsia="楷体" w:hAnsi="Times New Roman" w:cs="Times New Roman" w:hint="eastAsia"/>
@@ -9851,6 +9982,7 @@
         </w:rPr>
         <w:t>最终</w:t>
       </w:r>
+      <w:proofErr w:type="gramEnd"/>
       <w:r>
         <w:rPr>
           <w:rFonts w:ascii="Times New Roman" w:eastAsia="楷体" w:hAnsi="Times New Roman" w:cs="Times New Roman" w:hint="eastAsia"/>
@@ -10178,7 +10310,21 @@
         <w:rPr>
           <w:rFonts w:ascii="Times New Roman" w:eastAsia="楷体" w:hAnsi="Times New Roman" w:cs="Times New Roman" w:hint="eastAsia"/>
         </w:rPr>
-        <w:t>．无需最适</w:t>
+        <w:t>．无需</w:t>
+      </w:r>
+      <w:proofErr w:type="gramStart"/>
+      <w:r>
+        <w:rPr>
+          <w:rFonts w:ascii="Times New Roman" w:eastAsia="楷体" w:hAnsi="Times New Roman" w:cs="Times New Roman" w:hint="eastAsia"/>
+        </w:rPr>
+        <w:t>最</w:t>
+      </w:r>
+      <w:proofErr w:type="gramEnd"/>
+      <w:r>
+        <w:rPr>
+          <w:rFonts w:ascii="Times New Roman" w:eastAsia="楷体" w:hAnsi="Times New Roman" w:cs="Times New Roman" w:hint="eastAsia"/>
+        </w:rPr>
+        <w:t>适</w:t>
       </w:r>
       <w:r>
         <w:rPr>
@@ -10879,7 +11025,21 @@
         <w:rPr>
           <w:rFonts w:ascii="Times New Roman" w:eastAsia="楷体" w:hAnsi="Times New Roman" w:cs="Times New Roman" w:hint="eastAsia"/>
         </w:rPr>
-        <w:t>、人氯离子转运蛋白</w:t>
+        <w:t>、</w:t>
+      </w:r>
+      <w:proofErr w:type="gramStart"/>
+      <w:r>
+        <w:rPr>
+          <w:rFonts w:ascii="Times New Roman" w:eastAsia="楷体" w:hAnsi="Times New Roman" w:cs="Times New Roman" w:hint="eastAsia"/>
+        </w:rPr>
+        <w:t>人氯离子</w:t>
+      </w:r>
+      <w:proofErr w:type="gramEnd"/>
+      <w:r>
+        <w:rPr>
+          <w:rFonts w:ascii="Times New Roman" w:eastAsia="楷体" w:hAnsi="Times New Roman" w:cs="Times New Roman" w:hint="eastAsia"/>
+        </w:rPr>
+        <w:t>转运蛋白</w:t>
       </w:r>
       <w:r>
         <w:rPr>
@@ -11120,12 +11280,14 @@
         </w:rPr>
         <w:t>中合成的蛋白需获得正确的构象才能被转运，</w:t>
       </w:r>
+      <w:proofErr w:type="gramStart"/>
       <w:r>
         <w:rPr>
           <w:rFonts w:ascii="Times New Roman" w:eastAsia="楷体" w:hAnsi="Times New Roman" w:cs="Times New Roman" w:hint="eastAsia"/>
         </w:rPr>
         <w:t>下列能够</w:t>
       </w:r>
+      <w:proofErr w:type="gramEnd"/>
       <w:r>
         <w:rPr>
           <w:rFonts w:ascii="Times New Roman" w:eastAsia="楷体" w:hAnsi="Times New Roman" w:cs="Times New Roman" w:hint="eastAsia"/>
@@ -11148,13 +11310,7 @@
         <w:rPr>
           <w:rFonts w:ascii="Times New Roman" w:eastAsia="楷体" w:hAnsi="Times New Roman" w:cs="Times New Roman" w:hint="eastAsia"/>
         </w:rPr>
-        <w:t>象的是</w:t>
-      </w:r>
-      <w:r>
-        <w:rPr>
-          <w:rFonts w:ascii="Times New Roman" w:eastAsia="楷体" w:hAnsi="Times New Roman" w:cs="Times New Roman" w:hint="eastAsia"/>
-        </w:rPr>
-        <w:t>（</w:t>
+        <w:t>象的是（</w:t>
       </w:r>
       <w:r>
         <w:rPr>
@@ -12135,7 +12291,21 @@
         <w:rPr>
           <w:rFonts w:ascii="Times New Roman" w:eastAsia="楷体" w:hAnsi="Times New Roman" w:cs="Times New Roman" w:hint="eastAsia"/>
         </w:rPr>
-        <w:t>、下列哪类蛋白介导了转运小泡与靶向膜的融合（</w:t>
+        <w:t>、下列哪类蛋白</w:t>
+      </w:r>
+      <w:proofErr w:type="gramStart"/>
+      <w:r>
+        <w:rPr>
+          <w:rFonts w:ascii="Times New Roman" w:eastAsia="楷体" w:hAnsi="Times New Roman" w:cs="Times New Roman" w:hint="eastAsia"/>
+        </w:rPr>
+        <w:t>介</w:t>
+      </w:r>
+      <w:proofErr w:type="gramEnd"/>
+      <w:r>
+        <w:rPr>
+          <w:rFonts w:ascii="Times New Roman" w:eastAsia="楷体" w:hAnsi="Times New Roman" w:cs="Times New Roman" w:hint="eastAsia"/>
+        </w:rPr>
+        <w:t>导了转运小泡与靶向膜的融合（</w:t>
       </w:r>
       <w:r>
         <w:rPr>
@@ -12812,12 +12982,14 @@
         <w:t>、</w:t>
       </w:r>
       <w:bookmarkStart w:id="48" w:name="OLE_LINK20"/>
+      <w:proofErr w:type="gramStart"/>
       <w:r>
         <w:rPr>
           <w:rFonts w:ascii="Times New Roman" w:eastAsia="楷体" w:hAnsi="Times New Roman" w:cs="Times New Roman" w:hint="eastAsia"/>
         </w:rPr>
         <w:t>泛素连接酶</w:t>
       </w:r>
+      <w:proofErr w:type="gramEnd"/>
       <w:r>
         <w:rPr>
           <w:rFonts w:ascii="Times New Roman" w:eastAsia="楷体" w:hAnsi="Times New Roman" w:cs="Times New Roman" w:hint="eastAsia"/>
@@ -12828,14 +13000,36 @@
         <w:rPr>
           <w:rFonts w:ascii="Times New Roman" w:eastAsia="楷体" w:hAnsi="Times New Roman" w:cs="Times New Roman" w:hint="eastAsia"/>
         </w:rPr>
-        <w:t>最终将泛素蛋白连接到靶蛋白，</w:t>
+        <w:t>最终</w:t>
+      </w:r>
+      <w:proofErr w:type="gramStart"/>
+      <w:r>
+        <w:rPr>
+          <w:rFonts w:ascii="Times New Roman" w:eastAsia="楷体" w:hAnsi="Times New Roman" w:cs="Times New Roman" w:hint="eastAsia"/>
+        </w:rPr>
+        <w:t>将泛素蛋白</w:t>
+      </w:r>
+      <w:proofErr w:type="gramEnd"/>
+      <w:r>
+        <w:rPr>
+          <w:rFonts w:ascii="Times New Roman" w:eastAsia="楷体" w:hAnsi="Times New Roman" w:cs="Times New Roman" w:hint="eastAsia"/>
+        </w:rPr>
+        <w:t>连接到靶蛋白，</w:t>
       </w:r>
       <w:bookmarkEnd w:id="48"/>
-      <w:r>
-        <w:rPr>
-          <w:rFonts w:ascii="Times New Roman" w:eastAsia="楷体" w:hAnsi="Times New Roman" w:cs="Times New Roman" w:hint="eastAsia"/>
-        </w:rPr>
-        <w:t>泛素蛋白利用其（</w:t>
+      <w:proofErr w:type="gramStart"/>
+      <w:r>
+        <w:rPr>
+          <w:rFonts w:ascii="Times New Roman" w:eastAsia="楷体" w:hAnsi="Times New Roman" w:cs="Times New Roman" w:hint="eastAsia"/>
+        </w:rPr>
+        <w:t>泛素蛋白</w:t>
+      </w:r>
+      <w:proofErr w:type="gramEnd"/>
+      <w:r>
+        <w:rPr>
+          <w:rFonts w:ascii="Times New Roman" w:eastAsia="楷体" w:hAnsi="Times New Roman" w:cs="Times New Roman" w:hint="eastAsia"/>
+        </w:rPr>
+        <w:t>利用其（</w:t>
       </w:r>
       <w:r>
         <w:rPr>
@@ -13036,12 +13230,14 @@
         </w:rPr>
         <w:t>、</w:t>
       </w:r>
+      <w:proofErr w:type="gramStart"/>
       <w:r>
         <w:rPr>
           <w:rFonts w:ascii="Times New Roman" w:eastAsia="楷体" w:hAnsi="Times New Roman" w:cs="Times New Roman" w:hint="eastAsia"/>
         </w:rPr>
         <w:t>泛素连接酶</w:t>
       </w:r>
+      <w:proofErr w:type="gramEnd"/>
       <w:r>
         <w:rPr>
           <w:rFonts w:ascii="Times New Roman" w:eastAsia="楷体" w:hAnsi="Times New Roman" w:cs="Times New Roman" w:hint="eastAsia"/>
@@ -13052,13 +13248,49 @@
         <w:rPr>
           <w:rFonts w:ascii="Times New Roman" w:eastAsia="楷体" w:hAnsi="Times New Roman" w:cs="Times New Roman" w:hint="eastAsia"/>
         </w:rPr>
-        <w:t>最终将泛素蛋白连接到靶蛋白，</w:t>
-      </w:r>
-      <w:r>
-        <w:rPr>
-          <w:rFonts w:ascii="Times New Roman" w:eastAsia="楷体" w:hAnsi="Times New Roman" w:cs="Times New Roman" w:hint="eastAsia"/>
-        </w:rPr>
-        <w:t>泛素化修饰的靶蛋白中泛素蛋白结合的氨基酸是（</w:t>
+        <w:t>最终</w:t>
+      </w:r>
+      <w:proofErr w:type="gramStart"/>
+      <w:r>
+        <w:rPr>
+          <w:rFonts w:ascii="Times New Roman" w:eastAsia="楷体" w:hAnsi="Times New Roman" w:cs="Times New Roman" w:hint="eastAsia"/>
+        </w:rPr>
+        <w:t>将泛素蛋白</w:t>
+      </w:r>
+      <w:proofErr w:type="gramEnd"/>
+      <w:r>
+        <w:rPr>
+          <w:rFonts w:ascii="Times New Roman" w:eastAsia="楷体" w:hAnsi="Times New Roman" w:cs="Times New Roman" w:hint="eastAsia"/>
+        </w:rPr>
+        <w:t>连接到靶蛋白，</w:t>
+      </w:r>
+      <w:proofErr w:type="gramStart"/>
+      <w:r>
+        <w:rPr>
+          <w:rFonts w:ascii="Times New Roman" w:eastAsia="楷体" w:hAnsi="Times New Roman" w:cs="Times New Roman" w:hint="eastAsia"/>
+        </w:rPr>
+        <w:t>泛素化修饰</w:t>
+      </w:r>
+      <w:proofErr w:type="gramEnd"/>
+      <w:r>
+        <w:rPr>
+          <w:rFonts w:ascii="Times New Roman" w:eastAsia="楷体" w:hAnsi="Times New Roman" w:cs="Times New Roman" w:hint="eastAsia"/>
+        </w:rPr>
+        <w:t>的靶蛋白</w:t>
+      </w:r>
+      <w:proofErr w:type="gramStart"/>
+      <w:r>
+        <w:rPr>
+          <w:rFonts w:ascii="Times New Roman" w:eastAsia="楷体" w:hAnsi="Times New Roman" w:cs="Times New Roman" w:hint="eastAsia"/>
+        </w:rPr>
+        <w:t>中泛素蛋白结合</w:t>
+      </w:r>
+      <w:proofErr w:type="gramEnd"/>
+      <w:r>
+        <w:rPr>
+          <w:rFonts w:ascii="Times New Roman" w:eastAsia="楷体" w:hAnsi="Times New Roman" w:cs="Times New Roman" w:hint="eastAsia"/>
+        </w:rPr>
+        <w:t>的氨基酸是（</w:t>
       </w:r>
       <w:r>
         <w:rPr>
@@ -13245,7 +13477,21 @@
         <w:rPr>
           <w:rFonts w:ascii="Times New Roman" w:eastAsia="楷体" w:hAnsi="Times New Roman" w:cs="Times New Roman" w:hint="eastAsia"/>
         </w:rPr>
-        <w:t>下面哪位科学家因发现蛋白泛素化修饰介导的蛋白降解途径而获得诺贝奖（</w:t>
+        <w:t>下面哪位科学家因发现蛋白</w:t>
+      </w:r>
+      <w:proofErr w:type="gramStart"/>
+      <w:r>
+        <w:rPr>
+          <w:rFonts w:ascii="Times New Roman" w:eastAsia="楷体" w:hAnsi="Times New Roman" w:cs="Times New Roman" w:hint="eastAsia"/>
+        </w:rPr>
+        <w:t>泛素化修饰介</w:t>
+      </w:r>
+      <w:proofErr w:type="gramEnd"/>
+      <w:r>
+        <w:rPr>
+          <w:rFonts w:ascii="Times New Roman" w:eastAsia="楷体" w:hAnsi="Times New Roman" w:cs="Times New Roman" w:hint="eastAsia"/>
+        </w:rPr>
+        <w:t>导的蛋白降解途径而获得诺贝奖（</w:t>
       </w:r>
       <w:r>
         <w:rPr>
@@ -13456,11 +13702,19 @@
         </w:rPr>
         <w:t>、</w:t>
       </w:r>
-      <w:r>
-        <w:rPr>
-          <w:rFonts w:ascii="Times New Roman" w:eastAsia="楷体" w:hAnsi="Times New Roman" w:cs="Times New Roman" w:hint="eastAsia"/>
-        </w:rPr>
-        <w:t>泛素化修饰的蛋白最终由</w:t>
+      <w:proofErr w:type="gramStart"/>
+      <w:r>
+        <w:rPr>
+          <w:rFonts w:ascii="Times New Roman" w:eastAsia="楷体" w:hAnsi="Times New Roman" w:cs="Times New Roman" w:hint="eastAsia"/>
+        </w:rPr>
+        <w:t>泛素化修饰</w:t>
+      </w:r>
+      <w:proofErr w:type="gramEnd"/>
+      <w:r>
+        <w:rPr>
+          <w:rFonts w:ascii="Times New Roman" w:eastAsia="楷体" w:hAnsi="Times New Roman" w:cs="Times New Roman" w:hint="eastAsia"/>
+        </w:rPr>
+        <w:t>的蛋白最终由</w:t>
       </w:r>
       <w:r>
         <w:rPr>
@@ -14634,8 +14888,15 @@
       <w:r>
         <w:rPr>
           <w:rFonts w:ascii="Times New Roman" w:eastAsia="楷体" w:hAnsi="Times New Roman" w:cs="Times New Roman"/>
-        </w:rPr>
-        <w:t>组蛋白上的赖氨酸可发生多种化学化学修饰，包含（</w:t>
+          <w:color w:val="FF0000"/>
+        </w:rPr>
+        <w:t>组蛋白</w:t>
+      </w:r>
+      <w:r>
+        <w:rPr>
+          <w:rFonts w:ascii="Times New Roman" w:eastAsia="楷体" w:hAnsi="Times New Roman" w:cs="Times New Roman"/>
+        </w:rPr>
+        <w:t>上的赖氨酸可发生多种化学化学修饰，包含（</w:t>
       </w:r>
       <w:r>
         <w:rPr>
@@ -15449,12 +15710,14 @@
         </w:rPr>
         <w:t>．</w:t>
       </w:r>
+      <w:proofErr w:type="gramStart"/>
       <w:r>
         <w:rPr>
           <w:rFonts w:ascii="Times New Roman" w:eastAsia="楷体" w:hAnsi="Times New Roman" w:cs="Times New Roman" w:hint="eastAsia"/>
         </w:rPr>
         <w:t>泛素化</w:t>
       </w:r>
+      <w:proofErr w:type="gramEnd"/>
       <w:r>
         <w:rPr>
           <w:rFonts w:ascii="Times New Roman" w:eastAsia="楷体" w:hAnsi="Times New Roman" w:cs="Times New Roman"/>
@@ -15707,8 +15970,16 @@
         <w:rPr>
           <w:rFonts w:ascii="Times New Roman" w:eastAsia="楷体" w:hAnsi="Times New Roman" w:cs="Times New Roman"/>
         </w:rPr>
-        <w:t>．泛素化</w:t>
-      </w:r>
+        <w:t>．</w:t>
+      </w:r>
+      <w:proofErr w:type="gramStart"/>
+      <w:r>
+        <w:rPr>
+          <w:rFonts w:ascii="Times New Roman" w:eastAsia="楷体" w:hAnsi="Times New Roman" w:cs="Times New Roman"/>
+        </w:rPr>
+        <w:t>泛素化</w:t>
+      </w:r>
+      <w:proofErr w:type="gramEnd"/>
       <w:r>
         <w:rPr>
           <w:rFonts w:ascii="Times New Roman" w:eastAsia="楷体" w:hAnsi="Times New Roman" w:cs="Times New Roman" w:hint="eastAsia"/>
@@ -17056,8 +17327,16 @@
         <w:rPr>
           <w:rFonts w:ascii="Times New Roman" w:eastAsia="楷体" w:hAnsi="Times New Roman" w:cs="Times New Roman" w:hint="eastAsia"/>
         </w:rPr>
-        <w:t>．泛素化修饰</w:t>
-      </w:r>
+        <w:t>．</w:t>
+      </w:r>
+      <w:proofErr w:type="gramStart"/>
+      <w:r>
+        <w:rPr>
+          <w:rFonts w:ascii="Times New Roman" w:eastAsia="楷体" w:hAnsi="Times New Roman" w:cs="Times New Roman" w:hint="eastAsia"/>
+        </w:rPr>
+        <w:t>泛素化修饰</w:t>
+      </w:r>
+      <w:proofErr w:type="gramEnd"/>
       <w:r>
         <w:rPr>
           <w:rFonts w:ascii="Times New Roman" w:eastAsia="楷体" w:hAnsi="Times New Roman" w:cs="Times New Roman" w:hint="eastAsia"/>
@@ -17286,8 +17565,16 @@
         <w:rPr>
           <w:rFonts w:ascii="Times New Roman" w:eastAsia="楷体" w:hAnsi="Times New Roman" w:cs="Times New Roman" w:hint="eastAsia"/>
         </w:rPr>
-        <w:t>泛素化修饰</w:t>
-      </w:r>
+        <w:t>泛</w:t>
+      </w:r>
+      <w:proofErr w:type="gramStart"/>
+      <w:r>
+        <w:rPr>
+          <w:rFonts w:ascii="Times New Roman" w:eastAsia="楷体" w:hAnsi="Times New Roman" w:cs="Times New Roman" w:hint="eastAsia"/>
+        </w:rPr>
+        <w:t>素化修饰</w:t>
+      </w:r>
+      <w:proofErr w:type="gramEnd"/>
       <w:r>
         <w:rPr>
           <w:rFonts w:ascii="Times New Roman" w:eastAsia="楷体" w:hAnsi="Times New Roman" w:cs="Times New Roman" w:hint="eastAsia"/>
@@ -21267,8 +21554,16 @@
         <w:rPr>
           <w:rFonts w:ascii="Times New Roman" w:eastAsia="楷体" w:hAnsi="Times New Roman" w:cs="Times New Roman" w:hint="eastAsia"/>
         </w:rPr>
-        <w:t>α键短</w:t>
-      </w:r>
+        <w:t>α</w:t>
+      </w:r>
+      <w:proofErr w:type="gramStart"/>
+      <w:r>
+        <w:rPr>
+          <w:rFonts w:ascii="Times New Roman" w:eastAsia="楷体" w:hAnsi="Times New Roman" w:cs="Times New Roman" w:hint="eastAsia"/>
+        </w:rPr>
+        <w:t>键短</w:t>
+      </w:r>
+      <w:proofErr w:type="gramEnd"/>
       <w:r>
         <w:rPr>
           <w:rFonts w:ascii="Times New Roman" w:eastAsia="楷体" w:hAnsi="Times New Roman" w:cs="Times New Roman"/>
@@ -21429,11 +21724,19 @@
         </w:rPr>
         <w:t>C-N</w:t>
       </w:r>
-      <w:r>
-        <w:rPr>
-          <w:rFonts w:ascii="Times New Roman" w:eastAsia="楷体" w:hAnsi="Times New Roman" w:cs="Times New Roman" w:hint="eastAsia"/>
-        </w:rPr>
-        <w:t>键所相连的四个原子在同一平面上</w:t>
+      <w:proofErr w:type="gramStart"/>
+      <w:r>
+        <w:rPr>
+          <w:rFonts w:ascii="Times New Roman" w:eastAsia="楷体" w:hAnsi="Times New Roman" w:cs="Times New Roman" w:hint="eastAsia"/>
+        </w:rPr>
+        <w:t>键所相连</w:t>
+      </w:r>
+      <w:proofErr w:type="gramEnd"/>
+      <w:r>
+        <w:rPr>
+          <w:rFonts w:ascii="Times New Roman" w:eastAsia="楷体" w:hAnsi="Times New Roman" w:cs="Times New Roman" w:hint="eastAsia"/>
+        </w:rPr>
+        <w:t>的四个原子在同一平面上</w:t>
       </w:r>
     </w:p>
     <w:p>
@@ -22421,7 +22724,20 @@
         <w:rPr>
           <w:rFonts w:ascii="Times New Roman" w:eastAsia="楷体" w:hAnsi="Times New Roman" w:cs="Times New Roman" w:hint="eastAsia"/>
         </w:rPr>
-        <w:t>具有三级结构的多肽链都具有生物学活性</w:t>
+        <w:t>具有三级结构的多肽链</w:t>
+      </w:r>
+      <w:r>
+        <w:rPr>
+          <w:rFonts w:ascii="Times New Roman" w:eastAsia="楷体" w:hAnsi="Times New Roman" w:cs="Times New Roman" w:hint="eastAsia"/>
+          <w:color w:val="FF0000"/>
+        </w:rPr>
+        <w:t>都</w:t>
+      </w:r>
+      <w:r>
+        <w:rPr>
+          <w:rFonts w:ascii="Times New Roman" w:eastAsia="楷体" w:hAnsi="Times New Roman" w:cs="Times New Roman" w:hint="eastAsia"/>
+        </w:rPr>
+        <w:t>具有生物学活性</w:t>
       </w:r>
     </w:p>
     <w:p>
@@ -22700,7 +23016,20 @@
         <w:rPr>
           <w:rFonts w:ascii="Times New Roman" w:eastAsia="楷体" w:hAnsi="Times New Roman" w:cs="Times New Roman" w:hint="eastAsia"/>
         </w:rPr>
-        <w:t>其稳定性靠相邻的肽键平面间形成的氢键</w:t>
+        <w:t>其稳定性靠</w:t>
+      </w:r>
+      <w:r>
+        <w:rPr>
+          <w:rFonts w:ascii="Times New Roman" w:eastAsia="楷体" w:hAnsi="Times New Roman" w:cs="Times New Roman" w:hint="eastAsia"/>
+          <w:color w:val="FF0000"/>
+        </w:rPr>
+        <w:t>相邻</w:t>
+      </w:r>
+      <w:r>
+        <w:rPr>
+          <w:rFonts w:ascii="Times New Roman" w:eastAsia="楷体" w:hAnsi="Times New Roman" w:cs="Times New Roman" w:hint="eastAsia"/>
+        </w:rPr>
+        <w:t>的肽键平面间形成的氢键</w:t>
       </w:r>
     </w:p>
     <w:p>
@@ -22825,7 +23154,21 @@
         <w:rPr>
           <w:rFonts w:ascii="Times New Roman" w:eastAsia="楷体" w:hAnsi="Times New Roman" w:cs="Times New Roman" w:hint="eastAsia"/>
         </w:rPr>
-        <w:t>是由两条或两条以上具有三级结构的多肽链进一步折叠盘饶而成</w:t>
+        <w:t>是由两条或两条以上具有三级结构的多肽链进一步折叠</w:t>
+      </w:r>
+      <w:proofErr w:type="gramStart"/>
+      <w:r>
+        <w:rPr>
+          <w:rFonts w:ascii="Times New Roman" w:eastAsia="楷体" w:hAnsi="Times New Roman" w:cs="Times New Roman" w:hint="eastAsia"/>
+        </w:rPr>
+        <w:t>盘饶</w:t>
+      </w:r>
+      <w:proofErr w:type="gramEnd"/>
+      <w:r>
+        <w:rPr>
+          <w:rFonts w:ascii="Times New Roman" w:eastAsia="楷体" w:hAnsi="Times New Roman" w:cs="Times New Roman" w:hint="eastAsia"/>
+        </w:rPr>
+        <w:t>而成</w:t>
       </w:r>
       <w:r>
         <w:rPr>
@@ -23131,7 +23474,20 @@
         <w:rPr>
           <w:rFonts w:ascii="Times New Roman" w:eastAsia="楷体" w:hAnsi="Times New Roman" w:cs="Times New Roman" w:hint="eastAsia"/>
         </w:rPr>
-        <w:t>下列哪一种物质不属于生物活性肽？</w:t>
+        <w:t>下列哪一种物质不属于生物</w:t>
+      </w:r>
+      <w:r>
+        <w:rPr>
+          <w:rFonts w:ascii="Times New Roman" w:eastAsia="楷体" w:hAnsi="Times New Roman" w:cs="Times New Roman" w:hint="eastAsia"/>
+          <w:color w:val="FF0000"/>
+        </w:rPr>
+        <w:t>活性</w:t>
+      </w:r>
+      <w:r>
+        <w:rPr>
+          <w:rFonts w:ascii="Times New Roman" w:eastAsia="楷体" w:hAnsi="Times New Roman" w:cs="Times New Roman" w:hint="eastAsia"/>
+        </w:rPr>
+        <w:t>肽？</w:t>
       </w:r>
       <w:r>
         <w:rPr>
@@ -26125,8 +26481,16 @@
         <w:rPr>
           <w:rFonts w:ascii="Times New Roman" w:eastAsia="楷体" w:hAnsi="Times New Roman" w:cs="Times New Roman" w:hint="eastAsia"/>
         </w:rPr>
-        <w:t>溴化氰</w:t>
-      </w:r>
+        <w:t>溴化</w:t>
+      </w:r>
+      <w:proofErr w:type="gramStart"/>
+      <w:r>
+        <w:rPr>
+          <w:rFonts w:ascii="Times New Roman" w:eastAsia="楷体" w:hAnsi="Times New Roman" w:cs="Times New Roman" w:hint="eastAsia"/>
+        </w:rPr>
+        <w:t>氰</w:t>
+      </w:r>
+      <w:proofErr w:type="gramEnd"/>
       <w:r>
         <w:rPr>
           <w:rFonts w:ascii="Times New Roman" w:eastAsia="楷体" w:hAnsi="Times New Roman" w:cs="Times New Roman"/>
@@ -27711,7 +28075,21 @@
         <w:rPr>
           <w:rFonts w:ascii="Times New Roman" w:eastAsia="楷体" w:hAnsi="Times New Roman" w:cs="Times New Roman" w:hint="eastAsia"/>
         </w:rPr>
-        <w:t>氨基酸之间形成的次级键发生改变</w:t>
+        <w:t>氨基酸之间形成的次级</w:t>
+      </w:r>
+      <w:proofErr w:type="gramStart"/>
+      <w:r>
+        <w:rPr>
+          <w:rFonts w:ascii="Times New Roman" w:eastAsia="楷体" w:hAnsi="Times New Roman" w:cs="Times New Roman" w:hint="eastAsia"/>
+        </w:rPr>
+        <w:t>键发生</w:t>
+      </w:r>
+      <w:proofErr w:type="gramEnd"/>
+      <w:r>
+        <w:rPr>
+          <w:rFonts w:ascii="Times New Roman" w:eastAsia="楷体" w:hAnsi="Times New Roman" w:cs="Times New Roman" w:hint="eastAsia"/>
+        </w:rPr>
+        <w:t>改变</w:t>
       </w:r>
     </w:p>
     <w:p>
@@ -27979,11 +28357,19 @@
         </w:rPr>
         <w:t>、</w:t>
       </w:r>
-      <w:r>
-        <w:rPr>
-          <w:rFonts w:ascii="Times New Roman" w:eastAsia="楷体" w:hAnsi="Times New Roman" w:cs="Times New Roman" w:hint="eastAsia"/>
-        </w:rPr>
-        <w:t>处于等电状态的蛋白质</w:t>
+      <w:proofErr w:type="gramStart"/>
+      <w:r>
+        <w:rPr>
+          <w:rFonts w:ascii="Times New Roman" w:eastAsia="楷体" w:hAnsi="Times New Roman" w:cs="Times New Roman" w:hint="eastAsia"/>
+        </w:rPr>
+        <w:t>处于等电状态</w:t>
+      </w:r>
+      <w:proofErr w:type="gramEnd"/>
+      <w:r>
+        <w:rPr>
+          <w:rFonts w:ascii="Times New Roman" w:eastAsia="楷体" w:hAnsi="Times New Roman" w:cs="Times New Roman" w:hint="eastAsia"/>
+        </w:rPr>
+        <w:t>的蛋白质</w:t>
       </w:r>
       <w:r>
         <w:rPr>
@@ -28408,8 +28794,16 @@
         <w:rPr>
           <w:rFonts w:ascii="Times New Roman" w:eastAsia="楷体" w:hAnsi="Times New Roman" w:cs="Times New Roman" w:hint="eastAsia"/>
         </w:rPr>
-        <w:t>对蛋白质表面水化膜无影响</w:t>
-      </w:r>
+        <w:t>对蛋白质表面</w:t>
+      </w:r>
+      <w:proofErr w:type="gramStart"/>
+      <w:r>
+        <w:rPr>
+          <w:rFonts w:ascii="Times New Roman" w:eastAsia="楷体" w:hAnsi="Times New Roman" w:cs="Times New Roman" w:hint="eastAsia"/>
+        </w:rPr>
+        <w:t>水化膜无影响</w:t>
+      </w:r>
+      <w:proofErr w:type="gramEnd"/>
     </w:p>
     <w:p>
       <w:pPr>
@@ -28891,6 +29285,12 @@
           <w:rFonts w:ascii="Times New Roman" w:eastAsia="楷体" w:hAnsi="Times New Roman" w:cs="Times New Roman" w:hint="eastAsia"/>
         </w:rPr>
         <w:t>.</w:t>
+      </w:r>
+      <w:r>
+        <w:rPr>
+          <w:rFonts w:ascii="Times New Roman" w:eastAsia="楷体" w:hAnsi="Times New Roman" w:cs="Times New Roman"/>
+        </w:rPr>
+        <w:t xml:space="preserve">  </w:t>
       </w:r>
       <w:r>
         <w:rPr>
@@ -32361,7 +32761,14 @@
         <w:rPr>
           <w:rFonts w:ascii="Times New Roman" w:eastAsia="楷体" w:hAnsi="Times New Roman" w:cs="Times New Roman" w:hint="eastAsia"/>
         </w:rPr>
-        <w:t>、从下列选出含有</w:t>
+        <w:t>、从下列选出</w:t>
+      </w:r>
+      <w:proofErr w:type="gramStart"/>
+      <w:r>
+        <w:rPr>
+          <w:rFonts w:ascii="Times New Roman" w:eastAsia="楷体" w:hAnsi="Times New Roman" w:cs="Times New Roman" w:hint="eastAsia"/>
+        </w:rPr>
+        <w:t>含有</w:t>
       </w:r>
       <w:r>
         <w:rPr>
@@ -32369,6 +32776,7 @@
         </w:rPr>
         <w:t>羟乙基</w:t>
       </w:r>
+      <w:proofErr w:type="gramEnd"/>
       <w:r>
         <w:rPr>
           <w:rFonts w:ascii="Times New Roman" w:eastAsia="楷体" w:hAnsi="Times New Roman" w:cs="Times New Roman" w:hint="eastAsia"/>
@@ -32441,12 +32849,14 @@
         </w:rPr>
         <w:t>）、</w:t>
       </w:r>
+      <w:proofErr w:type="gramStart"/>
       <w:r>
         <w:rPr>
           <w:rFonts w:ascii="Times New Roman" w:eastAsia="楷体" w:hAnsi="Times New Roman" w:cs="Times New Roman" w:hint="eastAsia"/>
         </w:rPr>
         <w:t>硫醚键</w:t>
       </w:r>
+      <w:proofErr w:type="gramEnd"/>
       <w:r>
         <w:rPr>
           <w:rFonts w:ascii="Times New Roman" w:eastAsia="楷体" w:hAnsi="Times New Roman" w:cs="Times New Roman" w:hint="eastAsia"/>
@@ -33005,8 +33415,16 @@
         <w:rPr>
           <w:rFonts w:ascii="Times New Roman" w:eastAsia="楷体" w:hAnsi="Times New Roman" w:cs="Times New Roman" w:hint="eastAsia"/>
         </w:rPr>
-        <w:t>螺旋的键力是</w:t>
-      </w:r>
+        <w:t>螺旋</w:t>
+      </w:r>
+      <w:proofErr w:type="gramStart"/>
+      <w:r>
+        <w:rPr>
+          <w:rFonts w:ascii="Times New Roman" w:eastAsia="楷体" w:hAnsi="Times New Roman" w:cs="Times New Roman" w:hint="eastAsia"/>
+        </w:rPr>
+        <w:t>的键力是</w:t>
+      </w:r>
+      <w:proofErr w:type="gramEnd"/>
       <w:r>
         <w:rPr>
           <w:rFonts w:ascii="Times New Roman" w:eastAsia="楷体" w:hAnsi="Times New Roman" w:cs="Times New Roman" w:hint="eastAsia"/>
@@ -34425,7 +34843,21 @@
         <w:rPr>
           <w:rFonts w:ascii="Times New Roman" w:eastAsia="楷体" w:hAnsi="Times New Roman" w:cs="Times New Roman" w:hint="eastAsia"/>
         </w:rPr>
-        <w:t>在脯氨酸残基处结构被破坏的是</w:t>
+        <w:t>在脯氨酸残基</w:t>
+      </w:r>
+      <w:proofErr w:type="gramStart"/>
+      <w:r>
+        <w:rPr>
+          <w:rFonts w:ascii="Times New Roman" w:eastAsia="楷体" w:hAnsi="Times New Roman" w:cs="Times New Roman" w:hint="eastAsia"/>
+        </w:rPr>
+        <w:t>处结构</w:t>
+      </w:r>
+      <w:proofErr w:type="gramEnd"/>
+      <w:r>
+        <w:rPr>
+          <w:rFonts w:ascii="Times New Roman" w:eastAsia="楷体" w:hAnsi="Times New Roman" w:cs="Times New Roman" w:hint="eastAsia"/>
+        </w:rPr>
+        <w:t>被破坏的是</w:t>
       </w:r>
       <w:r>
         <w:rPr>
@@ -34754,7 +35186,19 @@
         <w:rPr>
           <w:rFonts w:ascii="Times New Roman" w:eastAsia="楷体" w:hAnsi="Times New Roman" w:cs="Times New Roman" w:hint="eastAsia"/>
         </w:rPr>
-        <w:t>蛋白质即变性又沉淀是加入了</w:t>
+        <w:t>蛋白质</w:t>
+      </w:r>
+      <w:r>
+        <w:rPr>
+          <w:rFonts w:ascii="Times New Roman" w:eastAsia="楷体" w:hAnsi="Times New Roman" w:cs="Times New Roman" w:hint="eastAsia"/>
+        </w:rPr>
+        <w:t>既</w:t>
+      </w:r>
+      <w:r>
+        <w:rPr>
+          <w:rFonts w:ascii="Times New Roman" w:eastAsia="楷体" w:hAnsi="Times New Roman" w:cs="Times New Roman" w:hint="eastAsia"/>
+        </w:rPr>
+        <w:t>变性又沉淀是加入了</w:t>
       </w:r>
       <w:r>
         <w:rPr>
@@ -34778,7 +35222,21 @@
         <w:rPr>
           <w:rFonts w:ascii="Times New Roman" w:eastAsia="楷体" w:hAnsi="Times New Roman" w:cs="Times New Roman" w:hint="eastAsia"/>
         </w:rPr>
-        <w:t>蛋白质变性但不沉淀是加入了</w:t>
+        <w:t>蛋白</w:t>
+      </w:r>
+      <w:proofErr w:type="gramStart"/>
+      <w:r>
+        <w:rPr>
+          <w:rFonts w:ascii="Times New Roman" w:eastAsia="楷体" w:hAnsi="Times New Roman" w:cs="Times New Roman" w:hint="eastAsia"/>
+        </w:rPr>
+        <w:t>质变性但不</w:t>
+      </w:r>
+      <w:proofErr w:type="gramEnd"/>
+      <w:r>
+        <w:rPr>
+          <w:rFonts w:ascii="Times New Roman" w:eastAsia="楷体" w:hAnsi="Times New Roman" w:cs="Times New Roman" w:hint="eastAsia"/>
+        </w:rPr>
+        <w:t>沉淀是加入了</w:t>
       </w:r>
       <w:r>
         <w:rPr>
@@ -35901,7 +36359,20 @@
         <w:rPr>
           <w:rFonts w:ascii="Times New Roman" w:eastAsia="楷体" w:hAnsi="Times New Roman" w:cs="Times New Roman" w:hint="eastAsia"/>
         </w:rPr>
-        <w:t>碳原子都是不对称碳原子</w:t>
+        <w:t>碳原子</w:t>
+      </w:r>
+      <w:r>
+        <w:rPr>
+          <w:rFonts w:ascii="Times New Roman" w:eastAsia="楷体" w:hAnsi="Times New Roman" w:cs="Times New Roman" w:hint="eastAsia"/>
+          <w:color w:val="FF0000"/>
+        </w:rPr>
+        <w:t>都是</w:t>
+      </w:r>
+      <w:r>
+        <w:rPr>
+          <w:rFonts w:ascii="Times New Roman" w:eastAsia="楷体" w:hAnsi="Times New Roman" w:cs="Times New Roman" w:hint="eastAsia"/>
+        </w:rPr>
+        <w:t>不对称碳原子</w:t>
       </w:r>
     </w:p>
     <w:p>
@@ -36306,11 +36777,19 @@
         </w:rPr>
         <w:t>．</w:t>
       </w:r>
-      <w:r>
-        <w:rPr>
-          <w:rFonts w:ascii="Times New Roman" w:eastAsia="楷体" w:hAnsi="Times New Roman" w:cs="Times New Roman" w:hint="eastAsia"/>
-        </w:rPr>
-        <w:t>肽是由氨基酸残基靠肽键连接而成</w:t>
+      <w:proofErr w:type="gramStart"/>
+      <w:r>
+        <w:rPr>
+          <w:rFonts w:ascii="Times New Roman" w:eastAsia="楷体" w:hAnsi="Times New Roman" w:cs="Times New Roman" w:hint="eastAsia"/>
+        </w:rPr>
+        <w:t>肽是由</w:t>
+      </w:r>
+      <w:proofErr w:type="gramEnd"/>
+      <w:r>
+        <w:rPr>
+          <w:rFonts w:ascii="Times New Roman" w:eastAsia="楷体" w:hAnsi="Times New Roman" w:cs="Times New Roman" w:hint="eastAsia"/>
+        </w:rPr>
+        <w:t>氨基酸残基靠肽键连接而成</w:t>
       </w:r>
       <w:r>
         <w:rPr>
@@ -36337,11 +36816,25 @@
         </w:rPr>
         <w:t>．</w:t>
       </w:r>
-      <w:r>
-        <w:rPr>
-          <w:rFonts w:ascii="Times New Roman" w:eastAsia="楷体" w:hAnsi="Times New Roman" w:cs="Times New Roman" w:hint="eastAsia"/>
-        </w:rPr>
-        <w:t>肽是组成蛋白质的基本单位</w:t>
+      <w:proofErr w:type="gramStart"/>
+      <w:r>
+        <w:rPr>
+          <w:rFonts w:ascii="Times New Roman" w:eastAsia="楷体" w:hAnsi="Times New Roman" w:cs="Times New Roman" w:hint="eastAsia"/>
+        </w:rPr>
+        <w:t>肽是组成</w:t>
+      </w:r>
+      <w:proofErr w:type="gramEnd"/>
+      <w:r>
+        <w:rPr>
+          <w:rFonts w:ascii="Times New Roman" w:eastAsia="楷体" w:hAnsi="Times New Roman" w:cs="Times New Roman" w:hint="eastAsia"/>
+        </w:rPr>
+        <w:t>蛋白质的基本单位</w:t>
+      </w:r>
+      <w:r>
+        <w:rPr>
+          <w:rFonts w:ascii="Times New Roman" w:eastAsia="楷体" w:hAnsi="Times New Roman" w:cs="Times New Roman" w:hint="eastAsia"/>
+        </w:rPr>
+        <w:t xml:space="preserve"> </w:t>
       </w:r>
     </w:p>
     <w:p>
@@ -36397,7 +36890,21 @@
         <w:rPr>
           <w:rFonts w:ascii="Times New Roman" w:eastAsia="楷体" w:hAnsi="Times New Roman" w:cs="Times New Roman" w:hint="eastAsia"/>
         </w:rPr>
-        <w:t>含有两个肽键的肽称为三肽</w:t>
+        <w:t>含有两个肽键的</w:t>
+      </w:r>
+      <w:proofErr w:type="gramStart"/>
+      <w:r>
+        <w:rPr>
+          <w:rFonts w:ascii="Times New Roman" w:eastAsia="楷体" w:hAnsi="Times New Roman" w:cs="Times New Roman" w:hint="eastAsia"/>
+        </w:rPr>
+        <w:t>肽称为</w:t>
+      </w:r>
+      <w:proofErr w:type="gramEnd"/>
+      <w:r>
+        <w:rPr>
+          <w:rFonts w:ascii="Times New Roman" w:eastAsia="楷体" w:hAnsi="Times New Roman" w:cs="Times New Roman" w:hint="eastAsia"/>
+        </w:rPr>
+        <w:t>三肽</w:t>
       </w:r>
     </w:p>
     <w:p>
@@ -36681,7 +37188,20 @@
         <w:rPr>
           <w:rFonts w:ascii="Times New Roman" w:eastAsia="楷体" w:hAnsi="Times New Roman" w:cs="Times New Roman" w:hint="eastAsia"/>
         </w:rPr>
-        <w:t>构成蛋白质的氨基酸均含有不对称碳原子</w:t>
+        <w:t>构成蛋白质的氨基酸</w:t>
+      </w:r>
+      <w:r>
+        <w:rPr>
+          <w:rFonts w:ascii="Times New Roman" w:eastAsia="楷体" w:hAnsi="Times New Roman" w:cs="Times New Roman" w:hint="eastAsia"/>
+          <w:color w:val="FF0000"/>
+        </w:rPr>
+        <w:t>均</w:t>
+      </w:r>
+      <w:r>
+        <w:rPr>
+          <w:rFonts w:ascii="Times New Roman" w:eastAsia="楷体" w:hAnsi="Times New Roman" w:cs="Times New Roman" w:hint="eastAsia"/>
+        </w:rPr>
+        <w:t>含有不对称碳原子</w:t>
       </w:r>
     </w:p>
     <w:p>
@@ -37307,7 +37827,21 @@
         <w:rPr>
           <w:rFonts w:ascii="Times New Roman" w:eastAsia="楷体" w:hAnsi="Times New Roman" w:cs="Times New Roman" w:hint="eastAsia"/>
         </w:rPr>
-        <w:t>酪氨酸的酚基</w:t>
+        <w:t>酪氨酸的</w:t>
+      </w:r>
+      <w:proofErr w:type="gramStart"/>
+      <w:r>
+        <w:rPr>
+          <w:rFonts w:ascii="Times New Roman" w:eastAsia="楷体" w:hAnsi="Times New Roman" w:cs="Times New Roman" w:hint="eastAsia"/>
+        </w:rPr>
+        <w:t>酚</w:t>
+      </w:r>
+      <w:proofErr w:type="gramEnd"/>
+      <w:r>
+        <w:rPr>
+          <w:rFonts w:ascii="Times New Roman" w:eastAsia="楷体" w:hAnsi="Times New Roman" w:cs="Times New Roman" w:hint="eastAsia"/>
+        </w:rPr>
+        <w:t>基</w:t>
       </w:r>
       <w:r>
         <w:rPr>
@@ -37732,7 +38266,20 @@
         <w:rPr>
           <w:rFonts w:ascii="Times New Roman" w:eastAsia="楷体" w:hAnsi="Times New Roman" w:cs="Times New Roman" w:hint="eastAsia"/>
         </w:rPr>
-        <w:t>是由谷氨酸、胱氨酸和甘氨酸组成</w:t>
+        <w:t>是由谷氨酸、</w:t>
+      </w:r>
+      <w:r>
+        <w:rPr>
+          <w:rFonts w:ascii="Times New Roman" w:eastAsia="楷体" w:hAnsi="Times New Roman" w:cs="Times New Roman" w:hint="eastAsia"/>
+          <w:color w:val="FF0000"/>
+        </w:rPr>
+        <w:t>胱氨酸</w:t>
+      </w:r>
+      <w:r>
+        <w:rPr>
+          <w:rFonts w:ascii="Times New Roman" w:eastAsia="楷体" w:hAnsi="Times New Roman" w:cs="Times New Roman" w:hint="eastAsia"/>
+        </w:rPr>
+        <w:t>和甘氨酸组成</w:t>
       </w:r>
       <w:r>
         <w:rPr>
@@ -37763,8 +38310,16 @@
         <w:rPr>
           <w:rFonts w:ascii="Times New Roman" w:eastAsia="楷体" w:hAnsi="Times New Roman" w:cs="Times New Roman" w:hint="eastAsia"/>
         </w:rPr>
-        <w:t>是一种重要的生物活性肽</w:t>
-      </w:r>
+        <w:t>是一种重要的生物活性</w:t>
+      </w:r>
+      <w:proofErr w:type="gramStart"/>
+      <w:r>
+        <w:rPr>
+          <w:rFonts w:ascii="Times New Roman" w:eastAsia="楷体" w:hAnsi="Times New Roman" w:cs="Times New Roman" w:hint="eastAsia"/>
+        </w:rPr>
+        <w:t>肽</w:t>
+      </w:r>
+      <w:proofErr w:type="gramEnd"/>
     </w:p>
     <w:p>
       <w:pPr>
@@ -38060,7 +38615,20 @@
         <w:rPr>
           <w:rFonts w:ascii="Times New Roman" w:eastAsia="楷体" w:hAnsi="Times New Roman" w:cs="Times New Roman" w:hint="eastAsia"/>
         </w:rPr>
-        <w:t>维持二级结构的化学键是肽键和氢键</w:t>
+        <w:t>维持二级结构的化学键是</w:t>
+      </w:r>
+      <w:r>
+        <w:rPr>
+          <w:rFonts w:ascii="Times New Roman" w:eastAsia="楷体" w:hAnsi="Times New Roman" w:cs="Times New Roman" w:hint="eastAsia"/>
+          <w:color w:val="FF0000"/>
+        </w:rPr>
+        <w:t>肽键</w:t>
+      </w:r>
+      <w:r>
+        <w:rPr>
+          <w:rFonts w:ascii="Times New Roman" w:eastAsia="楷体" w:hAnsi="Times New Roman" w:cs="Times New Roman" w:hint="eastAsia"/>
+        </w:rPr>
+        <w:t>和氢键</w:t>
       </w:r>
     </w:p>
     <w:p>
@@ -38214,7 +38782,20 @@
         <w:rPr>
           <w:rFonts w:ascii="Times New Roman" w:eastAsia="楷体" w:hAnsi="Times New Roman" w:cs="Times New Roman" w:hint="eastAsia"/>
         </w:rPr>
-        <w:t>螺旋是一种左手螺旋构象</w:t>
+        <w:t>螺旋是一种</w:t>
+      </w:r>
+      <w:r>
+        <w:rPr>
+          <w:rFonts w:ascii="Times New Roman" w:eastAsia="楷体" w:hAnsi="Times New Roman" w:cs="Times New Roman" w:hint="eastAsia"/>
+          <w:color w:val="FF0000"/>
+        </w:rPr>
+        <w:t>左手</w:t>
+      </w:r>
+      <w:r>
+        <w:rPr>
+          <w:rFonts w:ascii="Times New Roman" w:eastAsia="楷体" w:hAnsi="Times New Roman" w:cs="Times New Roman" w:hint="eastAsia"/>
+        </w:rPr>
+        <w:t>螺旋构象</w:t>
       </w:r>
       <w:r>
         <w:rPr>
@@ -38988,7 +39569,35 @@
         <w:rPr>
           <w:rFonts w:ascii="Times New Roman" w:eastAsia="楷体" w:hAnsi="Times New Roman" w:cs="Times New Roman" w:hint="eastAsia"/>
         </w:rPr>
-        <w:t>两链间聚合力维持其稳定</w:t>
+        <w:t>两链间</w:t>
+      </w:r>
+      <w:r>
+        <w:rPr>
+          <w:rFonts w:ascii="Times New Roman" w:eastAsia="楷体" w:hAnsi="Times New Roman" w:cs="Times New Roman" w:hint="eastAsia"/>
+          <w:color w:val="FF0000"/>
+        </w:rPr>
+        <w:t>聚合</w:t>
+      </w:r>
+      <w:proofErr w:type="gramStart"/>
+      <w:r>
+        <w:rPr>
+          <w:rFonts w:ascii="Times New Roman" w:eastAsia="楷体" w:hAnsi="Times New Roman" w:cs="Times New Roman" w:hint="eastAsia"/>
+          <w:color w:val="FF0000"/>
+        </w:rPr>
+        <w:t>力</w:t>
+      </w:r>
+      <w:r>
+        <w:rPr>
+          <w:rFonts w:ascii="Times New Roman" w:eastAsia="楷体" w:hAnsi="Times New Roman" w:cs="Times New Roman" w:hint="eastAsia"/>
+        </w:rPr>
+        <w:t>维持</w:t>
+      </w:r>
+      <w:proofErr w:type="gramEnd"/>
+      <w:r>
+        <w:rPr>
+          <w:rFonts w:ascii="Times New Roman" w:eastAsia="楷体" w:hAnsi="Times New Roman" w:cs="Times New Roman" w:hint="eastAsia"/>
+        </w:rPr>
+        <w:t>其稳定</w:t>
       </w:r>
     </w:p>
     <w:p>
@@ -39192,7 +39801,20 @@
         <w:rPr>
           <w:rFonts w:ascii="Times New Roman" w:eastAsia="楷体" w:hAnsi="Times New Roman" w:cs="Times New Roman" w:hint="eastAsia"/>
         </w:rPr>
-        <w:t>氨基酸侧链的疏水基团和辅基分布在分子内部</w:t>
+        <w:t>氨基酸侧链的疏水基团和</w:t>
+      </w:r>
+      <w:r>
+        <w:rPr>
+          <w:rFonts w:ascii="Times New Roman" w:eastAsia="楷体" w:hAnsi="Times New Roman" w:cs="Times New Roman" w:hint="eastAsia"/>
+          <w:color w:val="FF0000"/>
+        </w:rPr>
+        <w:t>辅基</w:t>
+      </w:r>
+      <w:r>
+        <w:rPr>
+          <w:rFonts w:ascii="Times New Roman" w:eastAsia="楷体" w:hAnsi="Times New Roman" w:cs="Times New Roman" w:hint="eastAsia"/>
+        </w:rPr>
+        <w:t>分布在分子内部</w:t>
       </w:r>
       <w:r>
         <w:rPr>
@@ -40640,12 +41262,28 @@
         </w:rPr>
         <w:t>．</w:t>
       </w:r>
-      <w:r>
-        <w:rPr>
-          <w:rFonts w:ascii="Times New Roman" w:eastAsia="楷体" w:hAnsi="Times New Roman" w:cs="Times New Roman" w:hint="eastAsia"/>
-        </w:rPr>
-        <w:t>茚三酮反应</w:t>
-      </w:r>
+      <w:proofErr w:type="gramStart"/>
+      <w:r>
+        <w:rPr>
+          <w:rFonts w:ascii="Times New Roman" w:eastAsia="楷体" w:hAnsi="Times New Roman" w:cs="Times New Roman" w:hint="eastAsia"/>
+        </w:rPr>
+        <w:t>茚</w:t>
+      </w:r>
+      <w:proofErr w:type="gramEnd"/>
+      <w:r>
+        <w:rPr>
+          <w:rFonts w:ascii="Times New Roman" w:eastAsia="楷体" w:hAnsi="Times New Roman" w:cs="Times New Roman" w:hint="eastAsia"/>
+        </w:rPr>
+        <w:t>三</w:t>
+      </w:r>
+      <w:proofErr w:type="gramStart"/>
+      <w:r>
+        <w:rPr>
+          <w:rFonts w:ascii="Times New Roman" w:eastAsia="楷体" w:hAnsi="Times New Roman" w:cs="Times New Roman" w:hint="eastAsia"/>
+        </w:rPr>
+        <w:t>酮反应</w:t>
+      </w:r>
+      <w:proofErr w:type="gramEnd"/>
       <w:r>
         <w:rPr>
           <w:rFonts w:ascii="Times New Roman" w:eastAsia="楷体" w:hAnsi="Times New Roman" w:cs="Times New Roman"/>
@@ -40712,11 +41350,19 @@
         </w:rPr>
         <w:t>．</w:t>
       </w:r>
-      <w:r>
-        <w:rPr>
-          <w:rFonts w:ascii="Times New Roman" w:eastAsia="楷体" w:hAnsi="Times New Roman" w:cs="Times New Roman" w:hint="eastAsia"/>
-        </w:rPr>
-        <w:t>酚试剂反应</w:t>
+      <w:proofErr w:type="gramStart"/>
+      <w:r>
+        <w:rPr>
+          <w:rFonts w:ascii="Times New Roman" w:eastAsia="楷体" w:hAnsi="Times New Roman" w:cs="Times New Roman" w:hint="eastAsia"/>
+        </w:rPr>
+        <w:t>酚</w:t>
+      </w:r>
+      <w:proofErr w:type="gramEnd"/>
+      <w:r>
+        <w:rPr>
+          <w:rFonts w:ascii="Times New Roman" w:eastAsia="楷体" w:hAnsi="Times New Roman" w:cs="Times New Roman" w:hint="eastAsia"/>
+        </w:rPr>
+        <w:t>试剂反应</w:t>
       </w:r>
       <w:r>
         <w:rPr>
@@ -41435,7 +42081,21 @@
         <w:rPr>
           <w:rFonts w:ascii="Times New Roman" w:eastAsia="楷体" w:hAnsi="Times New Roman" w:cs="Times New Roman" w:hint="eastAsia"/>
         </w:rPr>
-        <w:t>、酵母双杂交检测（</w:t>
+        <w:t>、</w:t>
+      </w:r>
+      <w:proofErr w:type="gramStart"/>
+      <w:r>
+        <w:rPr>
+          <w:rFonts w:ascii="Times New Roman" w:eastAsia="楷体" w:hAnsi="Times New Roman" w:cs="Times New Roman" w:hint="eastAsia"/>
+        </w:rPr>
+        <w:t>酵母双</w:t>
+      </w:r>
+      <w:proofErr w:type="gramEnd"/>
+      <w:r>
+        <w:rPr>
+          <w:rFonts w:ascii="Times New Roman" w:eastAsia="楷体" w:hAnsi="Times New Roman" w:cs="Times New Roman" w:hint="eastAsia"/>
+        </w:rPr>
+        <w:t>杂交检测（</w:t>
       </w:r>
       <w:r>
         <w:rPr>
@@ -42655,6 +43315,7 @@
         </w:rPr>
         <w:t>__</w:t>
       </w:r>
+      <w:proofErr w:type="gramStart"/>
       <w:r>
         <w:rPr>
           <w:rFonts w:ascii="Times New Roman" w:eastAsia="楷体" w:hAnsi="Times New Roman" w:cs="Times New Roman" w:hint="eastAsia"/>
@@ -42662,6 +43323,7 @@
         </w:rPr>
         <w:t>肽</w:t>
       </w:r>
+      <w:proofErr w:type="gramEnd"/>
       <w:r>
         <w:rPr>
           <w:rFonts w:ascii="Times New Roman" w:eastAsia="楷体" w:hAnsi="Times New Roman" w:cs="Times New Roman" w:hint="eastAsia"/>
@@ -42682,6 +43344,7 @@
         </w:rPr>
         <w:t>__</w:t>
       </w:r>
+      <w:proofErr w:type="gramStart"/>
       <w:r>
         <w:rPr>
           <w:rFonts w:ascii="Times New Roman" w:eastAsia="楷体" w:hAnsi="Times New Roman" w:cs="Times New Roman" w:hint="eastAsia"/>
@@ -42689,6 +43352,7 @@
         </w:rPr>
         <w:t>肽</w:t>
       </w:r>
+      <w:proofErr w:type="gramEnd"/>
       <w:r>
         <w:rPr>
           <w:rFonts w:ascii="Times New Roman" w:eastAsia="楷体" w:hAnsi="Times New Roman" w:cs="Times New Roman" w:hint="eastAsia"/>
@@ -42789,6 +43453,7 @@
         </w:rPr>
         <w:t>__</w:t>
       </w:r>
+      <w:proofErr w:type="gramStart"/>
       <w:r>
         <w:rPr>
           <w:rFonts w:ascii="Times New Roman" w:eastAsia="楷体" w:hAnsi="Times New Roman" w:cs="Times New Roman" w:hint="eastAsia"/>
@@ -42803,6 +43468,7 @@
         </w:rPr>
         <w:t>__</w:t>
       </w:r>
+      <w:proofErr w:type="gramEnd"/>
       <w:r>
         <w:rPr>
           <w:rFonts w:ascii="Times New Roman" w:eastAsia="楷体" w:hAnsi="Times New Roman" w:cs="Times New Roman" w:hint="eastAsia"/>
@@ -43955,11 +44621,19 @@
         </w:rPr>
         <w:t>__</w:t>
       </w:r>
-      <w:r>
-        <w:rPr>
-          <w:rFonts w:ascii="Times New Roman" w:eastAsia="楷体" w:hAnsi="Times New Roman" w:cs="Times New Roman" w:hint="eastAsia"/>
-        </w:rPr>
-        <w:t>极泳动，依次分为</w:t>
+      <w:proofErr w:type="gramStart"/>
+      <w:r>
+        <w:rPr>
+          <w:rFonts w:ascii="Times New Roman" w:eastAsia="楷体" w:hAnsi="Times New Roman" w:cs="Times New Roman" w:hint="eastAsia"/>
+        </w:rPr>
+        <w:t>极</w:t>
+      </w:r>
+      <w:proofErr w:type="gramEnd"/>
+      <w:r>
+        <w:rPr>
+          <w:rFonts w:ascii="Times New Roman" w:eastAsia="楷体" w:hAnsi="Times New Roman" w:cs="Times New Roman" w:hint="eastAsia"/>
+        </w:rPr>
+        <w:t>泳动，依次分为</w:t>
       </w:r>
       <w:r>
         <w:rPr>
@@ -44746,18 +45420,36 @@
         </w:rPr>
         <w:t>__</w:t>
       </w:r>
+      <w:proofErr w:type="gramStart"/>
       <w:r>
         <w:rPr>
           <w:rFonts w:ascii="Times New Roman" w:eastAsia="楷体" w:hAnsi="Times New Roman" w:cs="Times New Roman" w:hint="eastAsia"/>
           <w:u w:val="single"/>
         </w:rPr>
-        <w:t>茚三酮反应</w:t>
-      </w:r>
+        <w:t>茚</w:t>
+      </w:r>
+      <w:proofErr w:type="gramEnd"/>
       <w:r>
         <w:rPr>
           <w:rFonts w:ascii="Times New Roman" w:eastAsia="楷体" w:hAnsi="Times New Roman" w:cs="Times New Roman" w:hint="eastAsia"/>
           <w:u w:val="single"/>
         </w:rPr>
+        <w:t>三</w:t>
+      </w:r>
+      <w:proofErr w:type="gramStart"/>
+      <w:r>
+        <w:rPr>
+          <w:rFonts w:ascii="Times New Roman" w:eastAsia="楷体" w:hAnsi="Times New Roman" w:cs="Times New Roman" w:hint="eastAsia"/>
+          <w:u w:val="single"/>
+        </w:rPr>
+        <w:t>酮反应</w:t>
+      </w:r>
+      <w:proofErr w:type="gramEnd"/>
+      <w:r>
+        <w:rPr>
+          <w:rFonts w:ascii="Times New Roman" w:eastAsia="楷体" w:hAnsi="Times New Roman" w:cs="Times New Roman" w:hint="eastAsia"/>
+          <w:u w:val="single"/>
+        </w:rPr>
         <w:t>__</w:t>
       </w:r>
       <w:r>
@@ -44800,18 +45492,27 @@
         </w:rPr>
         <w:t>__</w:t>
       </w:r>
+      <w:proofErr w:type="gramStart"/>
       <w:r>
         <w:rPr>
           <w:rFonts w:ascii="Times New Roman" w:eastAsia="楷体" w:hAnsi="Times New Roman" w:cs="Times New Roman" w:hint="eastAsia"/>
           <w:u w:val="single"/>
         </w:rPr>
-        <w:t>酚试剂反应</w:t>
-      </w:r>
+        <w:t>酚</w:t>
+      </w:r>
+      <w:proofErr w:type="gramEnd"/>
       <w:r>
         <w:rPr>
           <w:rFonts w:ascii="Times New Roman" w:eastAsia="楷体" w:hAnsi="Times New Roman" w:cs="Times New Roman" w:hint="eastAsia"/>
           <w:u w:val="single"/>
         </w:rPr>
+        <w:t>试剂反应</w:t>
+      </w:r>
+      <w:r>
+        <w:rPr>
+          <w:rFonts w:ascii="Times New Roman" w:eastAsia="楷体" w:hAnsi="Times New Roman" w:cs="Times New Roman" w:hint="eastAsia"/>
+          <w:u w:val="single"/>
+        </w:rPr>
         <w:t>__</w:t>
       </w:r>
       <w:r>
@@ -45128,7 +45829,14 @@
         <w:rPr>
           <w:rFonts w:ascii="Times New Roman" w:eastAsia="楷体" w:hAnsi="Times New Roman" w:cs="Times New Roman" w:hint="eastAsia"/>
         </w:rPr>
-        <w:t>的作用而水解，最后彻底水解为各种</w:t>
+        <w:t>的作用而水解，最后彻底水解为</w:t>
+      </w:r>
+      <w:proofErr w:type="gramStart"/>
+      <w:r>
+        <w:rPr>
+          <w:rFonts w:ascii="Times New Roman" w:eastAsia="楷体" w:hAnsi="Times New Roman" w:cs="Times New Roman" w:hint="eastAsia"/>
+        </w:rPr>
+        <w:t>各种</w:t>
       </w:r>
       <w:r>
         <w:rPr>
@@ -45143,6 +45851,7 @@
         </w:rPr>
         <w:t>_</w:t>
       </w:r>
+      <w:proofErr w:type="gramEnd"/>
       <w:r>
         <w:rPr>
           <w:rFonts w:ascii="Times New Roman" w:eastAsia="楷体" w:hAnsi="Times New Roman" w:cs="Times New Roman" w:hint="eastAsia"/>
@@ -45310,6 +46019,7 @@
         </w:rPr>
         <w:t>__</w:t>
       </w:r>
+      <w:proofErr w:type="gramStart"/>
       <w:r>
         <w:rPr>
           <w:rFonts w:ascii="Times New Roman" w:eastAsia="楷体" w:hAnsi="Times New Roman" w:cs="Times New Roman" w:hint="eastAsia"/>
@@ -45317,6 +46027,7 @@
         </w:rPr>
         <w:t>羧</w:t>
       </w:r>
+      <w:proofErr w:type="gramEnd"/>
       <w:r>
         <w:rPr>
           <w:rFonts w:ascii="Times New Roman" w:eastAsia="楷体" w:hAnsi="Times New Roman" w:cs="Times New Roman" w:hint="eastAsia"/>
@@ -45523,7 +46234,21 @@
         <w:rPr>
           <w:rFonts w:ascii="Times New Roman" w:eastAsia="楷体" w:hAnsi="Times New Roman" w:cs="Times New Roman" w:hint="eastAsia"/>
         </w:rPr>
-        <w:t>电荷的溶液洗柱将蛋白质洗脱下来。</w:t>
+        <w:t>电荷的</w:t>
+      </w:r>
+      <w:proofErr w:type="gramStart"/>
+      <w:r>
+        <w:rPr>
+          <w:rFonts w:ascii="Times New Roman" w:eastAsia="楷体" w:hAnsi="Times New Roman" w:cs="Times New Roman" w:hint="eastAsia"/>
+        </w:rPr>
+        <w:t>溶液洗柱将</w:t>
+      </w:r>
+      <w:proofErr w:type="gramEnd"/>
+      <w:r>
+        <w:rPr>
+          <w:rFonts w:ascii="Times New Roman" w:eastAsia="楷体" w:hAnsi="Times New Roman" w:cs="Times New Roman" w:hint="eastAsia"/>
+        </w:rPr>
+        <w:t>蛋白质洗脱下来。</w:t>
       </w:r>
     </w:p>
     <w:p>
@@ -46361,11 +47086,19 @@
         </w:rPr>
         <w:t>Cα2</w:t>
       </w:r>
-      <w:r>
-        <w:rPr>
-          <w:rFonts w:ascii="Times New Roman" w:eastAsia="楷体" w:hAnsi="Times New Roman" w:cs="Times New Roman"/>
-        </w:rPr>
-        <w:t>六个原子固定在同一平面上，故称为肽键平面。</w:t>
+      <w:proofErr w:type="gramStart"/>
+      <w:r>
+        <w:rPr>
+          <w:rFonts w:ascii="Times New Roman" w:eastAsia="楷体" w:hAnsi="Times New Roman" w:cs="Times New Roman"/>
+        </w:rPr>
+        <w:t>六个</w:t>
+      </w:r>
+      <w:proofErr w:type="gramEnd"/>
+      <w:r>
+        <w:rPr>
+          <w:rFonts w:ascii="Times New Roman" w:eastAsia="楷体" w:hAnsi="Times New Roman" w:cs="Times New Roman"/>
+        </w:rPr>
+        <w:t>原子固定在同一平面上，故称为肽键平面。</w:t>
       </w:r>
     </w:p>
     <w:p>
@@ -46901,7 +47634,21 @@
         <w:rPr>
           <w:rFonts w:ascii="Times New Roman" w:eastAsia="楷体" w:hAnsi="Times New Roman" w:cs="Times New Roman"/>
         </w:rPr>
-        <w:t>带电粒子在电场的作用下，向它所带的电荷相反方向泳动的现象称为电泳。</w:t>
+        <w:t>带电粒子在电场的作用下，向它所带的电荷相反</w:t>
+      </w:r>
+      <w:proofErr w:type="gramStart"/>
+      <w:r>
+        <w:rPr>
+          <w:rFonts w:ascii="Times New Roman" w:eastAsia="楷体" w:hAnsi="Times New Roman" w:cs="Times New Roman"/>
+        </w:rPr>
+        <w:t>方向泳动的</w:t>
+      </w:r>
+      <w:proofErr w:type="gramEnd"/>
+      <w:r>
+        <w:rPr>
+          <w:rFonts w:ascii="Times New Roman" w:eastAsia="楷体" w:hAnsi="Times New Roman" w:cs="Times New Roman"/>
+        </w:rPr>
+        <w:t>现象称为电泳。</w:t>
       </w:r>
     </w:p>
     <w:p>
@@ -46955,7 +47702,21 @@
         <w:rPr>
           <w:rFonts w:ascii="Times New Roman" w:eastAsia="楷体" w:hAnsi="Times New Roman" w:cs="Times New Roman"/>
         </w:rPr>
-        <w:t>利用透析袋把大分子蛋白质与小分子化合物分开的方法称为透析。</w:t>
+        <w:t>利用</w:t>
+      </w:r>
+      <w:proofErr w:type="gramStart"/>
+      <w:r>
+        <w:rPr>
+          <w:rFonts w:ascii="Times New Roman" w:eastAsia="楷体" w:hAnsi="Times New Roman" w:cs="Times New Roman"/>
+        </w:rPr>
+        <w:t>透析袋把大分子</w:t>
+      </w:r>
+      <w:proofErr w:type="gramEnd"/>
+      <w:r>
+        <w:rPr>
+          <w:rFonts w:ascii="Times New Roman" w:eastAsia="楷体" w:hAnsi="Times New Roman" w:cs="Times New Roman"/>
+        </w:rPr>
+        <w:t>蛋白质与小分子化合物分开的方法称为透析。</w:t>
       </w:r>
     </w:p>
     <w:p>
@@ -47314,7 +48075,21 @@
         <w:rPr>
           <w:rFonts w:ascii="Times New Roman" w:eastAsia="楷体" w:hAnsi="Times New Roman" w:cs="Times New Roman" w:hint="eastAsia"/>
         </w:rPr>
-        <w:t>的复制过程。这是所有有细胞结构的生物所遵循的法则。在某些病毒中的</w:t>
+        <w:t>的复制过程。这是所有</w:t>
+      </w:r>
+      <w:proofErr w:type="gramStart"/>
+      <w:r>
+        <w:rPr>
+          <w:rFonts w:ascii="Times New Roman" w:eastAsia="楷体" w:hAnsi="Times New Roman" w:cs="Times New Roman" w:hint="eastAsia"/>
+        </w:rPr>
+        <w:t>有</w:t>
+      </w:r>
+      <w:proofErr w:type="gramEnd"/>
+      <w:r>
+        <w:rPr>
+          <w:rFonts w:ascii="Times New Roman" w:eastAsia="楷体" w:hAnsi="Times New Roman" w:cs="Times New Roman" w:hint="eastAsia"/>
+        </w:rPr>
+        <w:t>细胞结构的生物所遵循的法则。在某些病毒中的</w:t>
       </w:r>
       <w:r>
         <w:rPr>
@@ -47984,7 +48759,35 @@
         <w:rPr>
           <w:rFonts w:ascii="Times New Roman" w:eastAsia="楷体" w:hAnsi="Times New Roman" w:cs="Times New Roman" w:hint="eastAsia"/>
         </w:rPr>
-        <w:t>简述蛋白质的泛素化修饰类型以及每类修饰可能介导的蛋白质后续命运。</w:t>
+        <w:t>简述蛋白质的</w:t>
+      </w:r>
+      <w:proofErr w:type="gramStart"/>
+      <w:r>
+        <w:rPr>
+          <w:rFonts w:ascii="Times New Roman" w:eastAsia="楷体" w:hAnsi="Times New Roman" w:cs="Times New Roman" w:hint="eastAsia"/>
+        </w:rPr>
+        <w:t>泛素化修饰</w:t>
+      </w:r>
+      <w:proofErr w:type="gramEnd"/>
+      <w:r>
+        <w:rPr>
+          <w:rFonts w:ascii="Times New Roman" w:eastAsia="楷体" w:hAnsi="Times New Roman" w:cs="Times New Roman" w:hint="eastAsia"/>
+        </w:rPr>
+        <w:t>类型以及每类修饰可能</w:t>
+      </w:r>
+      <w:proofErr w:type="gramStart"/>
+      <w:r>
+        <w:rPr>
+          <w:rFonts w:ascii="Times New Roman" w:eastAsia="楷体" w:hAnsi="Times New Roman" w:cs="Times New Roman" w:hint="eastAsia"/>
+        </w:rPr>
+        <w:t>介</w:t>
+      </w:r>
+      <w:proofErr w:type="gramEnd"/>
+      <w:r>
+        <w:rPr>
+          <w:rFonts w:ascii="Times New Roman" w:eastAsia="楷体" w:hAnsi="Times New Roman" w:cs="Times New Roman" w:hint="eastAsia"/>
+        </w:rPr>
+        <w:t>导的蛋白质后续命运。</w:t>
       </w:r>
     </w:p>
     <w:p>
@@ -48009,7 +48812,21 @@
           <w:rFonts w:ascii="Times New Roman" w:eastAsia="楷体" w:hAnsi="Times New Roman" w:cs="Times New Roman" w:hint="eastAsia"/>
         </w:rPr>
         <w:lastRenderedPageBreak/>
-        <w:t>参考答案：单泛素化（</w:t>
+        <w:t>参考答案：</w:t>
+      </w:r>
+      <w:proofErr w:type="gramStart"/>
+      <w:r>
+        <w:rPr>
+          <w:rFonts w:ascii="Times New Roman" w:eastAsia="楷体" w:hAnsi="Times New Roman" w:cs="Times New Roman" w:hint="eastAsia"/>
+        </w:rPr>
+        <w:t>单泛素化</w:t>
+      </w:r>
+      <w:proofErr w:type="gramEnd"/>
+      <w:r>
+        <w:rPr>
+          <w:rFonts w:ascii="Times New Roman" w:eastAsia="楷体" w:hAnsi="Times New Roman" w:cs="Times New Roman" w:hint="eastAsia"/>
+        </w:rPr>
+        <w:t>（</w:t>
       </w:r>
       <w:r>
         <w:rPr>
@@ -48033,7 +48850,21 @@
         <w:rPr>
           <w:rFonts w:ascii="Times New Roman" w:eastAsia="楷体" w:hAnsi="Times New Roman" w:cs="Times New Roman" w:hint="eastAsia"/>
         </w:rPr>
-        <w:t>组蛋白修饰，调控染色质的结构；多位点单泛素化（</w:t>
+        <w:t>组蛋白修饰，调控染色质的结构；多位点</w:t>
+      </w:r>
+      <w:proofErr w:type="gramStart"/>
+      <w:r>
+        <w:rPr>
+          <w:rFonts w:ascii="Times New Roman" w:eastAsia="楷体" w:hAnsi="Times New Roman" w:cs="Times New Roman" w:hint="eastAsia"/>
+        </w:rPr>
+        <w:t>单泛素化</w:t>
+      </w:r>
+      <w:proofErr w:type="gramEnd"/>
+      <w:r>
+        <w:rPr>
+          <w:rFonts w:ascii="Times New Roman" w:eastAsia="楷体" w:hAnsi="Times New Roman" w:cs="Times New Roman" w:hint="eastAsia"/>
+        </w:rPr>
+        <w:t>（</w:t>
       </w:r>
       <w:r>
         <w:rPr>
@@ -48053,12 +48884,14 @@
         </w:rPr>
         <w:t xml:space="preserve">: </w:t>
       </w:r>
+      <w:proofErr w:type="gramStart"/>
       <w:r>
         <w:rPr>
           <w:rFonts w:ascii="Times New Roman" w:eastAsia="楷体" w:hAnsi="Times New Roman" w:cs="Times New Roman" w:hint="eastAsia"/>
         </w:rPr>
         <w:t>内吞形成</w:t>
       </w:r>
+      <w:proofErr w:type="gramEnd"/>
       <w:r>
         <w:rPr>
           <w:rFonts w:ascii="Times New Roman" w:eastAsia="楷体" w:hAnsi="Times New Roman" w:cs="Times New Roman" w:hint="eastAsia"/>
@@ -48069,14 +48902,50 @@
         <w:rPr>
           <w:rFonts w:ascii="Times New Roman" w:eastAsia="楷体" w:hAnsi="Times New Roman" w:cs="Times New Roman" w:hint="eastAsia"/>
         </w:rPr>
-        <w:t>，协助内吞物质与溶酶体融合，确保内吞物质被彻底降解；</w:t>
+        <w:t>，协助</w:t>
+      </w:r>
+      <w:proofErr w:type="gramStart"/>
+      <w:r>
+        <w:rPr>
+          <w:rFonts w:ascii="Times New Roman" w:eastAsia="楷体" w:hAnsi="Times New Roman" w:cs="Times New Roman" w:hint="eastAsia"/>
+        </w:rPr>
+        <w:t>内吞物质</w:t>
+      </w:r>
+      <w:proofErr w:type="gramEnd"/>
+      <w:r>
+        <w:rPr>
+          <w:rFonts w:ascii="Times New Roman" w:eastAsia="楷体" w:hAnsi="Times New Roman" w:cs="Times New Roman" w:hint="eastAsia"/>
+        </w:rPr>
+        <w:t>与溶酶体融合，确保</w:t>
+      </w:r>
+      <w:proofErr w:type="gramStart"/>
+      <w:r>
+        <w:rPr>
+          <w:rFonts w:ascii="Times New Roman" w:eastAsia="楷体" w:hAnsi="Times New Roman" w:cs="Times New Roman" w:hint="eastAsia"/>
+        </w:rPr>
+        <w:t>内吞物质</w:t>
+      </w:r>
+      <w:proofErr w:type="gramEnd"/>
+      <w:r>
+        <w:rPr>
+          <w:rFonts w:ascii="Times New Roman" w:eastAsia="楷体" w:hAnsi="Times New Roman" w:cs="Times New Roman" w:hint="eastAsia"/>
+        </w:rPr>
+        <w:t>被彻底降解；</w:t>
       </w:r>
       <w:bookmarkStart w:id="90" w:name="OLE_LINK33"/>
-      <w:r>
-        <w:rPr>
-          <w:rFonts w:ascii="Times New Roman" w:eastAsia="楷体" w:hAnsi="Times New Roman" w:cs="Times New Roman" w:hint="eastAsia"/>
-        </w:rPr>
-        <w:t>经泛素蛋白第</w:t>
+      <w:proofErr w:type="gramStart"/>
+      <w:r>
+        <w:rPr>
+          <w:rFonts w:ascii="Times New Roman" w:eastAsia="楷体" w:hAnsi="Times New Roman" w:cs="Times New Roman" w:hint="eastAsia"/>
+        </w:rPr>
+        <w:t>经泛素</w:t>
+      </w:r>
+      <w:proofErr w:type="gramEnd"/>
+      <w:r>
+        <w:rPr>
+          <w:rFonts w:ascii="Times New Roman" w:eastAsia="楷体" w:hAnsi="Times New Roman" w:cs="Times New Roman" w:hint="eastAsia"/>
+        </w:rPr>
+        <w:t>蛋白第</w:t>
       </w:r>
       <w:r>
         <w:rPr>
@@ -48100,7 +48969,21 @@
         <w:rPr>
           <w:rFonts w:ascii="Times New Roman" w:eastAsia="楷体" w:hAnsi="Times New Roman" w:cs="Times New Roman" w:hint="eastAsia"/>
         </w:rPr>
-        <w:t>）产生的多聚泛素化（</w:t>
+        <w:t>）产生的多</w:t>
+      </w:r>
+      <w:proofErr w:type="gramStart"/>
+      <w:r>
+        <w:rPr>
+          <w:rFonts w:ascii="Times New Roman" w:eastAsia="楷体" w:hAnsi="Times New Roman" w:cs="Times New Roman" w:hint="eastAsia"/>
+        </w:rPr>
+        <w:t>聚泛素化</w:t>
+      </w:r>
+      <w:proofErr w:type="gramEnd"/>
+      <w:r>
+        <w:rPr>
+          <w:rFonts w:ascii="Times New Roman" w:eastAsia="楷体" w:hAnsi="Times New Roman" w:cs="Times New Roman" w:hint="eastAsia"/>
+        </w:rPr>
+        <w:t>（</w:t>
       </w:r>
       <w:r>
         <w:rPr>
@@ -48133,11 +49016,19 @@
         </w:rPr>
         <w:t>蛋白酶体被降解；</w:t>
       </w:r>
-      <w:r>
-        <w:rPr>
-          <w:rFonts w:ascii="Times New Roman" w:eastAsia="楷体" w:hAnsi="Times New Roman" w:cs="Times New Roman" w:hint="eastAsia"/>
-        </w:rPr>
-        <w:t>经泛素蛋白第</w:t>
+      <w:proofErr w:type="gramStart"/>
+      <w:r>
+        <w:rPr>
+          <w:rFonts w:ascii="Times New Roman" w:eastAsia="楷体" w:hAnsi="Times New Roman" w:cs="Times New Roman" w:hint="eastAsia"/>
+        </w:rPr>
+        <w:t>经泛素</w:t>
+      </w:r>
+      <w:proofErr w:type="gramEnd"/>
+      <w:r>
+        <w:rPr>
+          <w:rFonts w:ascii="Times New Roman" w:eastAsia="楷体" w:hAnsi="Times New Roman" w:cs="Times New Roman" w:hint="eastAsia"/>
+        </w:rPr>
+        <w:t>蛋白第</w:t>
       </w:r>
       <w:r>
         <w:rPr>
@@ -48161,7 +49052,21 @@
         <w:rPr>
           <w:rFonts w:ascii="Times New Roman" w:eastAsia="楷体" w:hAnsi="Times New Roman" w:cs="Times New Roman" w:hint="eastAsia"/>
         </w:rPr>
-        <w:t>）产生的多聚泛素化（</w:t>
+        <w:t>）产生的多</w:t>
+      </w:r>
+      <w:proofErr w:type="gramStart"/>
+      <w:r>
+        <w:rPr>
+          <w:rFonts w:ascii="Times New Roman" w:eastAsia="楷体" w:hAnsi="Times New Roman" w:cs="Times New Roman" w:hint="eastAsia"/>
+        </w:rPr>
+        <w:t>聚泛素化</w:t>
+      </w:r>
+      <w:proofErr w:type="gramEnd"/>
+      <w:r>
+        <w:rPr>
+          <w:rFonts w:ascii="Times New Roman" w:eastAsia="楷体" w:hAnsi="Times New Roman" w:cs="Times New Roman" w:hint="eastAsia"/>
+        </w:rPr>
+        <w:t>（</w:t>
       </w:r>
       <w:r>
         <w:rPr>
@@ -48741,7 +49646,21 @@
         <w:rPr>
           <w:rFonts w:ascii="Times New Roman" w:eastAsia="楷体" w:hAnsi="Times New Roman" w:cs="Times New Roman" w:hint="eastAsia"/>
         </w:rPr>
-        <w:t>）泛素化修饰。</w:t>
+        <w:t>）</w:t>
+      </w:r>
+      <w:proofErr w:type="gramStart"/>
+      <w:r>
+        <w:rPr>
+          <w:rFonts w:ascii="Times New Roman" w:eastAsia="楷体" w:hAnsi="Times New Roman" w:cs="Times New Roman" w:hint="eastAsia"/>
+        </w:rPr>
+        <w:t>泛素化修饰</w:t>
+      </w:r>
+      <w:proofErr w:type="gramEnd"/>
+      <w:r>
+        <w:rPr>
+          <w:rFonts w:ascii="Times New Roman" w:eastAsia="楷体" w:hAnsi="Times New Roman" w:cs="Times New Roman" w:hint="eastAsia"/>
+        </w:rPr>
+        <w:t>。</w:t>
       </w:r>
     </w:p>
     <w:p>
@@ -48810,7 +49729,21 @@
         <w:rPr>
           <w:rFonts w:ascii="Times New Roman" w:eastAsia="楷体" w:hAnsi="Times New Roman" w:cs="Times New Roman" w:hint="eastAsia"/>
         </w:rPr>
-        <w:t>糖苷化两种修饰，</w:t>
+        <w:t>糖苷</w:t>
+      </w:r>
+      <w:proofErr w:type="gramStart"/>
+      <w:r>
+        <w:rPr>
+          <w:rFonts w:ascii="Times New Roman" w:eastAsia="楷体" w:hAnsi="Times New Roman" w:cs="Times New Roman" w:hint="eastAsia"/>
+        </w:rPr>
+        <w:t>化两种</w:t>
+      </w:r>
+      <w:proofErr w:type="gramEnd"/>
+      <w:r>
+        <w:rPr>
+          <w:rFonts w:ascii="Times New Roman" w:eastAsia="楷体" w:hAnsi="Times New Roman" w:cs="Times New Roman" w:hint="eastAsia"/>
+        </w:rPr>
+        <w:t>修饰，</w:t>
       </w:r>
       <w:r>
         <w:rPr>
@@ -48822,20 +49755,48 @@
         <w:rPr>
           <w:rFonts w:ascii="Times New Roman" w:eastAsia="楷体" w:hAnsi="Times New Roman" w:cs="Times New Roman" w:hint="eastAsia"/>
         </w:rPr>
-        <w:t>糖苷化发生在天冬酰胺，由糖基转移酶催化完成。</w:t>
-      </w:r>
-    </w:p>
-    <w:p>
-      <w:pPr>
-        <w:rPr>
-          <w:rFonts w:ascii="Times New Roman" w:eastAsia="楷体" w:hAnsi="Times New Roman" w:cs="Times New Roman"/>
-        </w:rPr>
-      </w:pPr>
-      <w:r>
-        <w:rPr>
-          <w:rFonts w:ascii="Times New Roman" w:eastAsia="楷体" w:hAnsi="Times New Roman" w:cs="Times New Roman" w:hint="eastAsia"/>
-        </w:rPr>
-        <w:t>功能：帮助蛋白形成正确构象、保护蛋白免遭降解、与其他分子互作。（共</w:t>
+        <w:t>糖苷</w:t>
+      </w:r>
+      <w:proofErr w:type="gramStart"/>
+      <w:r>
+        <w:rPr>
+          <w:rFonts w:ascii="Times New Roman" w:eastAsia="楷体" w:hAnsi="Times New Roman" w:cs="Times New Roman" w:hint="eastAsia"/>
+        </w:rPr>
+        <w:t>化发生</w:t>
+      </w:r>
+      <w:proofErr w:type="gramEnd"/>
+      <w:r>
+        <w:rPr>
+          <w:rFonts w:ascii="Times New Roman" w:eastAsia="楷体" w:hAnsi="Times New Roman" w:cs="Times New Roman" w:hint="eastAsia"/>
+        </w:rPr>
+        <w:t>在天冬酰胺，由糖基转移酶催化完成。</w:t>
+      </w:r>
+    </w:p>
+    <w:p>
+      <w:pPr>
+        <w:rPr>
+          <w:rFonts w:ascii="Times New Roman" w:eastAsia="楷体" w:hAnsi="Times New Roman" w:cs="Times New Roman"/>
+        </w:rPr>
+      </w:pPr>
+      <w:r>
+        <w:rPr>
+          <w:rFonts w:ascii="Times New Roman" w:eastAsia="楷体" w:hAnsi="Times New Roman" w:cs="Times New Roman" w:hint="eastAsia"/>
+        </w:rPr>
+        <w:t>功能：帮助蛋白形成正确构象、保护蛋白免遭降解、与其</w:t>
+      </w:r>
+      <w:proofErr w:type="gramStart"/>
+      <w:r>
+        <w:rPr>
+          <w:rFonts w:ascii="Times New Roman" w:eastAsia="楷体" w:hAnsi="Times New Roman" w:cs="Times New Roman" w:hint="eastAsia"/>
+        </w:rPr>
+        <w:t>他分子互</w:t>
+      </w:r>
+      <w:proofErr w:type="gramEnd"/>
+      <w:r>
+        <w:rPr>
+          <w:rFonts w:ascii="Times New Roman" w:eastAsia="楷体" w:hAnsi="Times New Roman" w:cs="Times New Roman" w:hint="eastAsia"/>
+        </w:rPr>
+        <w:t>作。（共</w:t>
       </w:r>
       <w:r>
         <w:rPr>
@@ -49034,14 +49995,28 @@
         <w:rPr>
           <w:rFonts w:ascii="Times New Roman" w:eastAsia="楷体" w:hAnsi="Times New Roman" w:cs="Times New Roman" w:hint="eastAsia"/>
         </w:rPr>
-        <w:t>上，去甲基化由去甲基化酶完成。功能：组蛋白乙酰化</w:t>
+        <w:t>上，去甲基化由去甲基化酶完成。功能：组蛋白乙酰</w:t>
+      </w:r>
+      <w:proofErr w:type="gramStart"/>
+      <w:r>
+        <w:rPr>
+          <w:rFonts w:ascii="Times New Roman" w:eastAsia="楷体" w:hAnsi="Times New Roman" w:cs="Times New Roman" w:hint="eastAsia"/>
+        </w:rPr>
+        <w:t>化</w:t>
       </w:r>
       <w:r>
         <w:rPr>
           <w:rFonts w:ascii="Times New Roman" w:eastAsia="楷体" w:hAnsi="Times New Roman" w:cs="Times New Roman" w:hint="eastAsia"/>
         </w:rPr>
         <w:lastRenderedPageBreak/>
-        <w:t>帮助激活基因表达。</w:t>
+        <w:t>帮助</w:t>
+      </w:r>
+      <w:proofErr w:type="gramEnd"/>
+      <w:r>
+        <w:rPr>
+          <w:rFonts w:ascii="Times New Roman" w:eastAsia="楷体" w:hAnsi="Times New Roman" w:cs="Times New Roman" w:hint="eastAsia"/>
+        </w:rPr>
+        <w:t>激活基因表达。</w:t>
       </w:r>
     </w:p>
     <w:p>
@@ -49067,7 +50042,35 @@
         <w:rPr>
           <w:rFonts w:ascii="Times New Roman" w:eastAsia="楷体" w:hAnsi="Times New Roman" w:cs="Times New Roman" w:hint="eastAsia"/>
         </w:rPr>
-        <w:t>）泛素化修饰：泛素化修饰经</w:t>
+        <w:t>）</w:t>
+      </w:r>
+      <w:proofErr w:type="gramStart"/>
+      <w:r>
+        <w:rPr>
+          <w:rFonts w:ascii="Times New Roman" w:eastAsia="楷体" w:hAnsi="Times New Roman" w:cs="Times New Roman" w:hint="eastAsia"/>
+        </w:rPr>
+        <w:t>泛素化修饰</w:t>
+      </w:r>
+      <w:proofErr w:type="gramEnd"/>
+      <w:r>
+        <w:rPr>
+          <w:rFonts w:ascii="Times New Roman" w:eastAsia="楷体" w:hAnsi="Times New Roman" w:cs="Times New Roman" w:hint="eastAsia"/>
+        </w:rPr>
+        <w:t>：</w:t>
+      </w:r>
+      <w:proofErr w:type="gramStart"/>
+      <w:r>
+        <w:rPr>
+          <w:rFonts w:ascii="Times New Roman" w:eastAsia="楷体" w:hAnsi="Times New Roman" w:cs="Times New Roman" w:hint="eastAsia"/>
+        </w:rPr>
+        <w:t>泛素化修饰</w:t>
+      </w:r>
+      <w:proofErr w:type="gramEnd"/>
+      <w:r>
+        <w:rPr>
+          <w:rFonts w:ascii="Times New Roman" w:eastAsia="楷体" w:hAnsi="Times New Roman" w:cs="Times New Roman" w:hint="eastAsia"/>
+        </w:rPr>
+        <w:t>经</w:t>
       </w:r>
       <w:r>
         <w:rPr>
@@ -49103,7 +50106,21 @@
         <w:rPr>
           <w:rFonts w:ascii="Times New Roman" w:eastAsia="楷体" w:hAnsi="Times New Roman" w:cs="Times New Roman" w:hint="eastAsia"/>
         </w:rPr>
-        <w:t>识别蛋白介导的系列反应完成，发生在</w:t>
+        <w:t>识别蛋白</w:t>
+      </w:r>
+      <w:proofErr w:type="gramStart"/>
+      <w:r>
+        <w:rPr>
+          <w:rFonts w:ascii="Times New Roman" w:eastAsia="楷体" w:hAnsi="Times New Roman" w:cs="Times New Roman" w:hint="eastAsia"/>
+        </w:rPr>
+        <w:t>介</w:t>
+      </w:r>
+      <w:proofErr w:type="gramEnd"/>
+      <w:r>
+        <w:rPr>
+          <w:rFonts w:ascii="Times New Roman" w:eastAsia="楷体" w:hAnsi="Times New Roman" w:cs="Times New Roman" w:hint="eastAsia"/>
+        </w:rPr>
+        <w:t>导的系列反应完成，发生在</w:t>
       </w:r>
       <w:r>
         <w:rPr>
@@ -49115,7 +50132,21 @@
         <w:rPr>
           <w:rFonts w:ascii="Times New Roman" w:eastAsia="楷体" w:hAnsi="Times New Roman" w:cs="Times New Roman" w:hint="eastAsia"/>
         </w:rPr>
-        <w:t>上，去泛素化由去泛素化酶完成。</w:t>
+        <w:t>上，</w:t>
+      </w:r>
+      <w:proofErr w:type="gramStart"/>
+      <w:r>
+        <w:rPr>
+          <w:rFonts w:ascii="Times New Roman" w:eastAsia="楷体" w:hAnsi="Times New Roman" w:cs="Times New Roman" w:hint="eastAsia"/>
+        </w:rPr>
+        <w:t>去泛素化由去泛素化</w:t>
+      </w:r>
+      <w:proofErr w:type="gramEnd"/>
+      <w:r>
+        <w:rPr>
+          <w:rFonts w:ascii="Times New Roman" w:eastAsia="楷体" w:hAnsi="Times New Roman" w:cs="Times New Roman" w:hint="eastAsia"/>
+        </w:rPr>
+        <w:t>酶完成。</w:t>
       </w:r>
     </w:p>
     <w:p>
@@ -49186,7 +50217,21 @@
         <w:rPr>
           <w:rFonts w:ascii="Times New Roman" w:eastAsia="楷体" w:hAnsi="Times New Roman" w:cs="Times New Roman" w:hint="eastAsia"/>
         </w:rPr>
-        <w:t>组成蛋白质的元素主要有碳、氢、氧、氮、硫，这是生物蛋白质所共有的，除此之外，有些蛋白质尚含有少量的磷或金属元素，如：铁、铜、锌、锰、钴、钼等，个别蛋白质还含有碘。其中各种蛋白质的含氮量很接近，是蛋白质分子中的特征性成分，约占蛋白质总量的</w:t>
+        <w:t>组成蛋白质的元素主要有碳、氢、氧、氮、硫，这是生物蛋白质所共有的，除此之外，有些蛋白质尚含有少量的磷或金属元素，如：铁、铜、锌、锰、钴、</w:t>
+      </w:r>
+      <w:proofErr w:type="gramStart"/>
+      <w:r>
+        <w:rPr>
+          <w:rFonts w:ascii="Times New Roman" w:eastAsia="楷体" w:hAnsi="Times New Roman" w:cs="Times New Roman" w:hint="eastAsia"/>
+        </w:rPr>
+        <w:t>钼</w:t>
+      </w:r>
+      <w:proofErr w:type="gramEnd"/>
+      <w:r>
+        <w:rPr>
+          <w:rFonts w:ascii="Times New Roman" w:eastAsia="楷体" w:hAnsi="Times New Roman" w:cs="Times New Roman" w:hint="eastAsia"/>
+        </w:rPr>
+        <w:t>等，个别蛋白质还含有碘。其中各种蛋白质的含氮量很接近，是蛋白质分子中的特征性成分，约占蛋白质总量的</w:t>
       </w:r>
       <w:r>
         <w:rPr>
@@ -49234,7 +50279,21 @@
         <w:rPr>
           <w:rFonts w:ascii="Times New Roman" w:eastAsia="楷体" w:hAnsi="Times New Roman" w:cs="Times New Roman" w:hint="eastAsia"/>
         </w:rPr>
-        <w:t>即可推算出该样品的蛋白质含量，即常用的定氮法。</w:t>
+        <w:t>即可推算出该样品的蛋白质含量，即常用的</w:t>
+      </w:r>
+      <w:proofErr w:type="gramStart"/>
+      <w:r>
+        <w:rPr>
+          <w:rFonts w:ascii="Times New Roman" w:eastAsia="楷体" w:hAnsi="Times New Roman" w:cs="Times New Roman" w:hint="eastAsia"/>
+        </w:rPr>
+        <w:t>定氮法</w:t>
+      </w:r>
+      <w:proofErr w:type="gramEnd"/>
+      <w:r>
+        <w:rPr>
+          <w:rFonts w:ascii="Times New Roman" w:eastAsia="楷体" w:hAnsi="Times New Roman" w:cs="Times New Roman" w:hint="eastAsia"/>
+        </w:rPr>
+        <w:t>。</w:t>
       </w:r>
     </w:p>
     <w:p>
@@ -49632,8 +50691,16 @@
         <w:rPr>
           <w:rFonts w:ascii="Times New Roman" w:eastAsia="楷体" w:hAnsi="Times New Roman" w:cs="Times New Roman" w:hint="eastAsia"/>
         </w:rPr>
-        <w:t>）参与血红素的合成：合成血红素的原料包括：甘氨酸、琥珀酰</w:t>
-      </w:r>
+        <w:t>）参与血红素的合成：合成血红素的原料包括：甘氨酸、琥珀</w:t>
+      </w:r>
+      <w:proofErr w:type="gramStart"/>
+      <w:r>
+        <w:rPr>
+          <w:rFonts w:ascii="Times New Roman" w:eastAsia="楷体" w:hAnsi="Times New Roman" w:cs="Times New Roman" w:hint="eastAsia"/>
+        </w:rPr>
+        <w:t>酰</w:t>
+      </w:r>
+      <w:proofErr w:type="gramEnd"/>
       <w:r>
         <w:rPr>
           <w:rFonts w:ascii="Times New Roman" w:eastAsia="楷体" w:hAnsi="Times New Roman" w:cs="Times New Roman" w:hint="eastAsia"/>
@@ -49695,14 +50762,9 @@
 </file>
 
 <file path=word/endnotes.xml><?xml version="1.0" encoding="utf-8"?>
-<w:endnotes xmlns:wpc="http://schemas.microsoft.com/office/word/2010/wordprocessingCanvas" xmlns:cx="http://schemas.microsoft.com/office/drawing/2014/chartex" xmlns:cx1="http://schemas.microsoft.com/office/drawing/2015/9/8/chartex" xmlns:cx2="http://schemas.microsoft.com/office/drawing/2015/10/21/chartex" xmlns:cx3="http://schemas.microsoft.com/office/drawing/2016/5/9/chartex" xmlns:cx4="http://schemas.microsoft.com/office/drawing/2016/5/10/chartex" xmlns:cx5="http://schemas.microsoft.com/office/drawing/2016/5/11/chartex" xmlns:cx6="http://schemas.microsoft.com/office/drawing/2016/5/12/chartex" xmlns:cx7="http://schemas.microsoft.com/office/drawing/2016/5/13/chartex" xmlns:cx8="http://schemas.microsoft.com/office/drawing/2016/5/14/chartex" xmlns:mc="http://schemas.openxmlformats.org/markup-compatibility/2006" xmlns:aink="http://schemas.microsoft.com/office/drawing/2016/ink" xmlns:am3d="http://schemas.microsoft.com/office/drawing/2017/model3d" xmlns:o="urn:schemas-microsoft-com:office:office" xmlns:oel="http://schemas.microsoft.com/office/2019/extlst" xmlns:r="http://schemas.openxmlformats.org/officeDocument/2006/relationships" xmlns:m="http://schemas.openxmlformats.org/officeDocument/2006/math" xmlns:v="urn:schemas-microsoft-com:vml" xmlns:wp14="http://schemas.microsoft.com/office/word/2010/wordprocessingDrawing" xmlns:wp="http://schemas.openxmlformats.org/drawingml/2006/wordprocessingDrawing" xmlns:w10="urn:schemas-microsoft-com:office:word" xmlns:w="http://schemas.openxmlformats.org/wordprocessingml/2006/main" xmlns:w14="http://schemas.microsoft.com/office/word/2010/wordml" xmlns:w15="http://schemas.microsoft.com/office/word/2012/wordml" xmlns:w16cex="http://schemas.microsoft.com/office/word/2018/wordml/cex" xmlns:w16cid="http://schemas.microsoft.com/office/word/2016/wordml/cid" xmlns:w16="http://schemas.microsoft.com/office/word/2018/wordml" xmlns:w16du="http://schemas.microsoft.com/office/word/2023/wordml/word16du" xmlns:w16sdtdh="http://schemas.microsoft.com/office/word/2020/wordml/sdtdatahash" xmlns:w16sdtfl="http://schemas.microsoft.com/office/word/2024/wordml/sdtformatlock" xmlns:w16se="http://schemas.microsoft.com/office/word/2015/wordml/symex" xmlns:wpg="http://schemas.microsoft.com/office/word/2010/wordprocessingGroup" xmlns:wpi="http://schemas.microsoft.com/office/word/2010/wordprocessingInk" xmlns:wne="http://schemas.microsoft.com/office/word/2006/wordml" xmlns:wps="http://schemas.microsoft.com/office/word/2010/wordprocessingShape" mc:Ignorable="w14 w15 w16se w16cid w16 w16cex w16sdtdh w16sdtfl w16du wp14">
+<w:endnotes xmlns:wpc="http://schemas.microsoft.com/office/word/2010/wordprocessingCanvas" xmlns:cx="http://schemas.microsoft.com/office/drawing/2014/chartex" xmlns:cx1="http://schemas.microsoft.com/office/drawing/2015/9/8/chartex" xmlns:cx2="http://schemas.microsoft.com/office/drawing/2015/10/21/chartex" xmlns:cx3="http://schemas.microsoft.com/office/drawing/2016/5/9/chartex" xmlns:cx4="http://schemas.microsoft.com/office/drawing/2016/5/10/chartex" xmlns:cx5="http://schemas.microsoft.com/office/drawing/2016/5/11/chartex" xmlns:cx6="http://schemas.microsoft.com/office/drawing/2016/5/12/chartex" xmlns:cx7="http://schemas.microsoft.com/office/drawing/2016/5/13/chartex" xmlns:cx8="http://schemas.microsoft.com/office/drawing/2016/5/14/chartex" xmlns:mc="http://schemas.openxmlformats.org/markup-compatibility/2006" xmlns:aink="http://schemas.microsoft.com/office/drawing/2016/ink" xmlns:am3d="http://schemas.microsoft.com/office/drawing/2017/model3d" xmlns:o="urn:schemas-microsoft-com:office:office" xmlns:r="http://schemas.openxmlformats.org/officeDocument/2006/relationships" xmlns:m="http://schemas.openxmlformats.org/officeDocument/2006/math" xmlns:v="urn:schemas-microsoft-com:vml" xmlns:wp14="http://schemas.microsoft.com/office/word/2010/wordprocessingDrawing" xmlns:wp="http://schemas.openxmlformats.org/drawingml/2006/wordprocessingDrawing" xmlns:w10="urn:schemas-microsoft-com:office:word" xmlns:w="http://schemas.openxmlformats.org/wordprocessingml/2006/main" xmlns:w14="http://schemas.microsoft.com/office/word/2010/wordml" xmlns:w15="http://schemas.microsoft.com/office/word/2012/wordml" xmlns:w16cex="http://schemas.microsoft.com/office/word/2018/wordml/cex" xmlns:w16cid="http://schemas.microsoft.com/office/word/2016/wordml/cid" xmlns:w16="http://schemas.microsoft.com/office/word/2018/wordml" xmlns:w16sdtdh="http://schemas.microsoft.com/office/word/2020/wordml/sdtdatahash" xmlns:w16se="http://schemas.microsoft.com/office/word/2015/wordml/symex" xmlns:wpg="http://schemas.microsoft.com/office/word/2010/wordprocessingGroup" xmlns:wpi="http://schemas.microsoft.com/office/word/2010/wordprocessingInk" xmlns:wne="http://schemas.microsoft.com/office/word/2006/wordml" xmlns:wps="http://schemas.microsoft.com/office/word/2010/wordprocessingShape" mc:Ignorable="w14 w15 w16se w16cid w16 w16cex w16sdtdh wp14">
   <w:endnote w:type="separator" w:id="-1">
     <w:p>
-      <w:pPr>
-        <w:rPr>
-          <w:rFonts w:hint="eastAsia"/>
-        </w:rPr>
-      </w:pPr>
       <w:r>
         <w:separator/>
       </w:r>
@@ -49710,11 +50772,6 @@
   </w:endnote>
   <w:endnote w:type="continuationSeparator" w:id="0">
     <w:p>
-      <w:pPr>
-        <w:rPr>
-          <w:rFonts w:hint="eastAsia"/>
-        </w:rPr>
-      </w:pPr>
       <w:r>
         <w:continuationSeparator/>
       </w:r>
@@ -49724,14 +50781,9 @@
 </file>
 
 <file path=word/footnotes.xml><?xml version="1.0" encoding="utf-8"?>
-<w:footnotes xmlns:wpc="http://schemas.microsoft.com/office/word/2010/wordprocessingCanvas" xmlns:cx="http://schemas.microsoft.com/office/drawing/2014/chartex" xmlns:cx1="http://schemas.microsoft.com/office/drawing/2015/9/8/chartex" xmlns:cx2="http://schemas.microsoft.com/office/drawing/2015/10/21/chartex" xmlns:cx3="http://schemas.microsoft.com/office/drawing/2016/5/9/chartex" xmlns:cx4="http://schemas.microsoft.com/office/drawing/2016/5/10/chartex" xmlns:cx5="http://schemas.microsoft.com/office/drawing/2016/5/11/chartex" xmlns:cx6="http://schemas.microsoft.com/office/drawing/2016/5/12/chartex" xmlns:cx7="http://schemas.microsoft.com/office/drawing/2016/5/13/chartex" xmlns:cx8="http://schemas.microsoft.com/office/drawing/2016/5/14/chartex" xmlns:mc="http://schemas.openxmlformats.org/markup-compatibility/2006" xmlns:aink="http://schemas.microsoft.com/office/drawing/2016/ink" xmlns:am3d="http://schemas.microsoft.com/office/drawing/2017/model3d" xmlns:o="urn:schemas-microsoft-com:office:office" xmlns:oel="http://schemas.microsoft.com/office/2019/extlst" xmlns:r="http://schemas.openxmlformats.org/officeDocument/2006/relationships" xmlns:m="http://schemas.openxmlformats.org/officeDocument/2006/math" xmlns:v="urn:schemas-microsoft-com:vml" xmlns:wp14="http://schemas.microsoft.com/office/word/2010/wordprocessingDrawing" xmlns:wp="http://schemas.openxmlformats.org/drawingml/2006/wordprocessingDrawing" xmlns:w10="urn:schemas-microsoft-com:office:word" xmlns:w="http://schemas.openxmlformats.org/wordprocessingml/2006/main" xmlns:w14="http://schemas.microsoft.com/office/word/2010/wordml" xmlns:w15="http://schemas.microsoft.com/office/word/2012/wordml" xmlns:w16cex="http://schemas.microsoft.com/office/word/2018/wordml/cex" xmlns:w16cid="http://schemas.microsoft.com/office/word/2016/wordml/cid" xmlns:w16="http://schemas.microsoft.com/office/word/2018/wordml" xmlns:w16du="http://schemas.microsoft.com/office/word/2023/wordml/word16du" xmlns:w16sdtdh="http://schemas.microsoft.com/office/word/2020/wordml/sdtdatahash" xmlns:w16sdtfl="http://schemas.microsoft.com/office/word/2024/wordml/sdtformatlock" xmlns:w16se="http://schemas.microsoft.com/office/word/2015/wordml/symex" xmlns:wpg="http://schemas.microsoft.com/office/word/2010/wordprocessingGroup" xmlns:wpi="http://schemas.microsoft.com/office/word/2010/wordprocessingInk" xmlns:wne="http://schemas.microsoft.com/office/word/2006/wordml" xmlns:wps="http://schemas.microsoft.com/office/word/2010/wordprocessingShape" mc:Ignorable="w14 w15 w16se w16cid w16 w16cex w16sdtdh w16sdtfl w16du wp14">
+<w:footnotes xmlns:wpc="http://schemas.microsoft.com/office/word/2010/wordprocessingCanvas" xmlns:cx="http://schemas.microsoft.com/office/drawing/2014/chartex" xmlns:cx1="http://schemas.microsoft.com/office/drawing/2015/9/8/chartex" xmlns:cx2="http://schemas.microsoft.com/office/drawing/2015/10/21/chartex" xmlns:cx3="http://schemas.microsoft.com/office/drawing/2016/5/9/chartex" xmlns:cx4="http://schemas.microsoft.com/office/drawing/2016/5/10/chartex" xmlns:cx5="http://schemas.microsoft.com/office/drawing/2016/5/11/chartex" xmlns:cx6="http://schemas.microsoft.com/office/drawing/2016/5/12/chartex" xmlns:cx7="http://schemas.microsoft.com/office/drawing/2016/5/13/chartex" xmlns:cx8="http://schemas.microsoft.com/office/drawing/2016/5/14/chartex" xmlns:mc="http://schemas.openxmlformats.org/markup-compatibility/2006" xmlns:aink="http://schemas.microsoft.com/office/drawing/2016/ink" xmlns:am3d="http://schemas.microsoft.com/office/drawing/2017/model3d" xmlns:o="urn:schemas-microsoft-com:office:office" xmlns:r="http://schemas.openxmlformats.org/officeDocument/2006/relationships" xmlns:m="http://schemas.openxmlformats.org/officeDocument/2006/math" xmlns:v="urn:schemas-microsoft-com:vml" xmlns:wp14="http://schemas.microsoft.com/office/word/2010/wordprocessingDrawing" xmlns:wp="http://schemas.openxmlformats.org/drawingml/2006/wordprocessingDrawing" xmlns:w10="urn:schemas-microsoft-com:office:word" xmlns:w="http://schemas.openxmlformats.org/wordprocessingml/2006/main" xmlns:w14="http://schemas.microsoft.com/office/word/2010/wordml" xmlns:w15="http://schemas.microsoft.com/office/word/2012/wordml" xmlns:w16cex="http://schemas.microsoft.com/office/word/2018/wordml/cex" xmlns:w16cid="http://schemas.microsoft.com/office/word/2016/wordml/cid" xmlns:w16="http://schemas.microsoft.com/office/word/2018/wordml" xmlns:w16sdtdh="http://schemas.microsoft.com/office/word/2020/wordml/sdtdatahash" xmlns:w16se="http://schemas.microsoft.com/office/word/2015/wordml/symex" xmlns:wpg="http://schemas.microsoft.com/office/word/2010/wordprocessingGroup" xmlns:wpi="http://schemas.microsoft.com/office/word/2010/wordprocessingInk" xmlns:wne="http://schemas.microsoft.com/office/word/2006/wordml" xmlns:wps="http://schemas.microsoft.com/office/word/2010/wordprocessingShape" mc:Ignorable="w14 w15 w16se w16cid w16 w16cex w16sdtdh wp14">
   <w:footnote w:type="separator" w:id="-1">
     <w:p>
-      <w:pPr>
-        <w:rPr>
-          <w:rFonts w:hint="eastAsia"/>
-        </w:rPr>
-      </w:pPr>
       <w:r>
         <w:separator/>
       </w:r>
@@ -49739,11 +50791,6 @@
   </w:footnote>
   <w:footnote w:type="continuationSeparator" w:id="0">
     <w:p>
-      <w:pPr>
-        <w:rPr>
-          <w:rFonts w:hint="eastAsia"/>
-        </w:rPr>
-      </w:pPr>
       <w:r>
         <w:continuationSeparator/>
       </w:r>
@@ -49753,7 +50800,7 @@
 </file>
 
 <file path=word/numbering.xml><?xml version="1.0" encoding="utf-8"?>
-<w:numbering xmlns:wpc="http://schemas.microsoft.com/office/word/2010/wordprocessingCanvas" xmlns:cx="http://schemas.microsoft.com/office/drawing/2014/chartex" xmlns:cx1="http://schemas.microsoft.com/office/drawing/2015/9/8/chartex" xmlns:cx2="http://schemas.microsoft.com/office/drawing/2015/10/21/chartex" xmlns:cx3="http://schemas.microsoft.com/office/drawing/2016/5/9/chartex" xmlns:cx4="http://schemas.microsoft.com/office/drawing/2016/5/10/chartex" xmlns:cx5="http://schemas.microsoft.com/office/drawing/2016/5/11/chartex" xmlns:cx6="http://schemas.microsoft.com/office/drawing/2016/5/12/chartex" xmlns:cx7="http://schemas.microsoft.com/office/drawing/2016/5/13/chartex" xmlns:cx8="http://schemas.microsoft.com/office/drawing/2016/5/14/chartex" xmlns:mc="http://schemas.openxmlformats.org/markup-compatibility/2006" xmlns:aink="http://schemas.microsoft.com/office/drawing/2016/ink" xmlns:am3d="http://schemas.microsoft.com/office/drawing/2017/model3d" xmlns:o="urn:schemas-microsoft-com:office:office" xmlns:oel="http://schemas.microsoft.com/office/2019/extlst" xmlns:r="http://schemas.openxmlformats.org/officeDocument/2006/relationships" xmlns:m="http://schemas.openxmlformats.org/officeDocument/2006/math" xmlns:v="urn:schemas-microsoft-com:vml" xmlns:wp14="http://schemas.microsoft.com/office/word/2010/wordprocessingDrawing" xmlns:wp="http://schemas.openxmlformats.org/drawingml/2006/wordprocessingDrawing" xmlns:w10="urn:schemas-microsoft-com:office:word" xmlns:w="http://schemas.openxmlformats.org/wordprocessingml/2006/main" xmlns:w14="http://schemas.microsoft.com/office/word/2010/wordml" xmlns:w15="http://schemas.microsoft.com/office/word/2012/wordml" xmlns:w16cex="http://schemas.microsoft.com/office/word/2018/wordml/cex" xmlns:w16cid="http://schemas.microsoft.com/office/word/2016/wordml/cid" xmlns:w16="http://schemas.microsoft.com/office/word/2018/wordml" xmlns:w16du="http://schemas.microsoft.com/office/word/2023/wordml/word16du" xmlns:w16sdtdh="http://schemas.microsoft.com/office/word/2020/wordml/sdtdatahash" xmlns:w16sdtfl="http://schemas.microsoft.com/office/word/2024/wordml/sdtformatlock" xmlns:w16se="http://schemas.microsoft.com/office/word/2015/wordml/symex" xmlns:wpg="http://schemas.microsoft.com/office/word/2010/wordprocessingGroup" xmlns:wpi="http://schemas.microsoft.com/office/word/2010/wordprocessingInk" xmlns:wne="http://schemas.microsoft.com/office/word/2006/wordml" xmlns:wps="http://schemas.microsoft.com/office/word/2010/wordprocessingShape" mc:Ignorable="w14 w15 w16se w16cid w16 w16cex w16sdtdh w16sdtfl w16du wp14">
+<w:numbering xmlns:wpc="http://schemas.microsoft.com/office/word/2010/wordprocessingCanvas" xmlns:cx="http://schemas.microsoft.com/office/drawing/2014/chartex" xmlns:cx1="http://schemas.microsoft.com/office/drawing/2015/9/8/chartex" xmlns:cx2="http://schemas.microsoft.com/office/drawing/2015/10/21/chartex" xmlns:cx3="http://schemas.microsoft.com/office/drawing/2016/5/9/chartex" xmlns:cx4="http://schemas.microsoft.com/office/drawing/2016/5/10/chartex" xmlns:cx5="http://schemas.microsoft.com/office/drawing/2016/5/11/chartex" xmlns:cx6="http://schemas.microsoft.com/office/drawing/2016/5/12/chartex" xmlns:cx7="http://schemas.microsoft.com/office/drawing/2016/5/13/chartex" xmlns:cx8="http://schemas.microsoft.com/office/drawing/2016/5/14/chartex" xmlns:mc="http://schemas.openxmlformats.org/markup-compatibility/2006" xmlns:aink="http://schemas.microsoft.com/office/drawing/2016/ink" xmlns:am3d="http://schemas.microsoft.com/office/drawing/2017/model3d" xmlns:o="urn:schemas-microsoft-com:office:office" xmlns:r="http://schemas.openxmlformats.org/officeDocument/2006/relationships" xmlns:m="http://schemas.openxmlformats.org/officeDocument/2006/math" xmlns:v="urn:schemas-microsoft-com:vml" xmlns:wp14="http://schemas.microsoft.com/office/word/2010/wordprocessingDrawing" xmlns:wp="http://schemas.openxmlformats.org/drawingml/2006/wordprocessingDrawing" xmlns:w10="urn:schemas-microsoft-com:office:word" xmlns:w="http://schemas.openxmlformats.org/wordprocessingml/2006/main" xmlns:w14="http://schemas.microsoft.com/office/word/2010/wordml" xmlns:w15="http://schemas.microsoft.com/office/word/2012/wordml" xmlns:w16cex="http://schemas.microsoft.com/office/word/2018/wordml/cex" xmlns:w16cid="http://schemas.microsoft.com/office/word/2016/wordml/cid" xmlns:w16="http://schemas.microsoft.com/office/word/2018/wordml" xmlns:w16sdtdh="http://schemas.microsoft.com/office/word/2020/wordml/sdtdatahash" xmlns:w16se="http://schemas.microsoft.com/office/word/2015/wordml/symex" xmlns:wpg="http://schemas.microsoft.com/office/word/2010/wordprocessingGroup" xmlns:wpi="http://schemas.microsoft.com/office/word/2010/wordprocessingInk" xmlns:wne="http://schemas.microsoft.com/office/word/2006/wordml" xmlns:wps="http://schemas.microsoft.com/office/word/2010/wordprocessingShape" mc:Ignorable="w14 w15 w16se w16cid w16 w16cex w16sdtdh wp14">
   <w:abstractNum w:abstractNumId="0" w15:restartNumberingAfterBreak="0">
     <w:nsid w:val="10CD2A25"/>
     <w:multiLevelType w:val="hybridMultilevel"/>
@@ -49845,14 +50892,14 @@
       </w:pPr>
     </w:lvl>
   </w:abstractNum>
-  <w:num w:numId="1" w16cid:durableId="1304238708">
+  <w:num w:numId="1">
     <w:abstractNumId w:val="0"/>
   </w:num>
 </w:numbering>
 </file>
 
 <file path=word/styles.xml><?xml version="1.0" encoding="utf-8"?>
-<w:styles xmlns:mc="http://schemas.openxmlformats.org/markup-compatibility/2006" xmlns:r="http://schemas.openxmlformats.org/officeDocument/2006/relationships" xmlns:w="http://schemas.openxmlformats.org/wordprocessingml/2006/main" xmlns:w14="http://schemas.microsoft.com/office/word/2010/wordml" xmlns:w15="http://schemas.microsoft.com/office/word/2012/wordml" xmlns:w16cex="http://schemas.microsoft.com/office/word/2018/wordml/cex" xmlns:w16cid="http://schemas.microsoft.com/office/word/2016/wordml/cid" xmlns:w16="http://schemas.microsoft.com/office/word/2018/wordml" xmlns:w16du="http://schemas.microsoft.com/office/word/2023/wordml/word16du" xmlns:w16sdtdh="http://schemas.microsoft.com/office/word/2020/wordml/sdtdatahash" xmlns:w16sdtfl="http://schemas.microsoft.com/office/word/2024/wordml/sdtformatlock" xmlns:w16se="http://schemas.microsoft.com/office/word/2015/wordml/symex" mc:Ignorable="w14 w15 w16se w16cid w16 w16cex w16sdtdh w16sdtfl w16du">
+<w:styles xmlns:mc="http://schemas.openxmlformats.org/markup-compatibility/2006" xmlns:r="http://schemas.openxmlformats.org/officeDocument/2006/relationships" xmlns:w="http://schemas.openxmlformats.org/wordprocessingml/2006/main" xmlns:w14="http://schemas.microsoft.com/office/word/2010/wordml" xmlns:w15="http://schemas.microsoft.com/office/word/2012/wordml" xmlns:w16cex="http://schemas.microsoft.com/office/word/2018/wordml/cex" xmlns:w16cid="http://schemas.microsoft.com/office/word/2016/wordml/cid" xmlns:w16="http://schemas.microsoft.com/office/word/2018/wordml" xmlns:w16sdtdh="http://schemas.microsoft.com/office/word/2020/wordml/sdtdatahash" xmlns:w16se="http://schemas.microsoft.com/office/word/2015/wordml/symex" mc:Ignorable="w14 w15 w16se w16cid w16 w16cex w16sdtdh">
   <w:docDefaults>
     <w:rPrDefault>
       <w:rPr>

</xml_diff>